<commit_message>
fix: se corrige planteamiento del problema, ya que no se acoplaba a los objetivos, dansole al documento mayor sentido
</commit_message>
<xml_diff>
--- a/célula-1/documentos/informe de requisitos.docx
+++ b/célula-1/documentos/informe de requisitos.docx
@@ -1861,72 +1861,30 @@
     </w:p>
     <w:p>
       <w:r>
-        <w:t>El presente documento define, estructura y formaliza los requisitos correspondientes al módulo "Catálogo de Productos Nutresa", el cual ha sido asignado a la Célula 1 dentro del marco de desarrollo del proyecto “Sazón”. Este proyecto consiste en una plataforma digital full-</w:t>
-      </w:r>
-      <w:proofErr w:type="spellStart"/>
-      <w:r>
-        <w:t>stack</w:t>
-      </w:r>
-      <w:proofErr w:type="spellEnd"/>
-      <w:r>
-        <w:t xml:space="preserve"> de alta envergadura diseñada para Grupo Nutresa, cuya propuesta de valor central radica en permitir a los usuarios gestionar su despensa virtual y recibir recomendaciones de recetas reales basadas en los ingredientes que ya poseen en casa. En este ecosistema tecnológico, el trabajo coordinado entre siete células de desarrollo resulta indispensable para consolidar una experiencia de usuario integral que abarque desde la planificación de menús hasta el cálculo del aporte nutricional.</w:t>
-      </w:r>
-    </w:p>
-    <w:p>
-      <w:r>
-        <w:t xml:space="preserve">Dentro de esta arquitectura distribuida, el módulo delegado a la Célula 1 actúa como la base estructural e indispensable de toda la aplicación: es el maestro de productos, marcas y presentaciones. Su correcta implementación es crítica, ya que provee la información base sobre la cual los demás módulos (como el recetario, la despensa virtual y el planificador) construirán sus lógicas de negocio. Este catálogo centralizado gestionará el portafolio de marcas emblemáticas del grupo, incluyendo Zenú, Noel, Doria, </w:t>
-      </w:r>
-      <w:proofErr w:type="spellStart"/>
-      <w:r>
-        <w:t>Colcafé</w:t>
-      </w:r>
-      <w:proofErr w:type="spellEnd"/>
-      <w:r>
-        <w:t xml:space="preserve">, </w:t>
-      </w:r>
-      <w:proofErr w:type="spellStart"/>
-      <w:r>
-        <w:t>Chocolisto</w:t>
-      </w:r>
-      <w:proofErr w:type="spellEnd"/>
-      <w:r>
-        <w:t>, Jet y Ranchera, garantizando que la información de cada insumo sea precisa, escalable y fácilmente consumible por el resto del sistema a través de una API REST unificada.</w:t>
+        <w:t>El presente documento define, estructura y formaliza los requisitos correspondientes al módulo "Catálogo de Productos Nutresa", el cual ha sido asignado a la Célula 1 dentro del marco de desarrollo del proyecto “Sazón”. Este proyecto consiste en una plataforma digital full-stack de alta envergadura diseñada para Grupo Nutresa, cuya propuesta de valor central radica en permitir a los usuarios gestionar su despensa virtual y recibir recomendaciones de recetas reales basadas en los ingredientes que ya poseen en casa. En este ecosistema tecnológico, el trabajo coordinado entre siete células de desarrollo resulta indispensable para consolidar una experiencia de usuario integral que abarque desde la planificación de menús hasta el cálculo del aporte nutricional.</w:t>
+      </w:r>
+    </w:p>
+    <w:p>
+      <w:r>
+        <w:t>Dentro de esta arquitectura distribuida, el módulo delegado a la Célula 1 actúa como la base estructural e indispensable de toda la aplicación: es el maestro de productos, marcas y presentaciones. Su correcta implementación es crítica, ya que provee la información base sobre la cual los demás módulos (como el recetario, la despensa virtual y el planificador) construirán sus lógicas de negocio. Este catálogo centralizado gestionará el portafolio de marcas emblemáticas del grupo, incluyendo Zenú, Noel, Doria, Colcafé, Chocolisto, Jet y Ranchera, garantizando que la información de cada insumo sea precisa, escalable y fácilmente consumible por el resto del sistema a través de una API REST unificada.</w:t>
       </w:r>
     </w:p>
     <w:p>
       <w:r>
         <w:t>Desde el punto de vista técnico y metodológico, la construcción de este módulo exige un enfoque de desarrollo de extremo a extremo (</w:t>
       </w:r>
-      <w:proofErr w:type="spellStart"/>
-      <w:r>
-        <w:t>end-to-end</w:t>
-      </w:r>
-      <w:proofErr w:type="spellEnd"/>
-      <w:r>
-        <w:t>).</w:t>
-      </w:r>
-      <w:r>
-        <w:t xml:space="preserve"> Esto implica el diseño de una interfaz de usuario interactiva y responsiva utilizando </w:t>
-      </w:r>
-      <w:proofErr w:type="spellStart"/>
-      <w:r>
-        <w:t>React</w:t>
-      </w:r>
-      <w:proofErr w:type="spellEnd"/>
-      <w:r>
-        <w:t xml:space="preserve">, la construcción de una </w:t>
+      <w:r>
+        <w:t>end-to-end).</w:t>
+      </w:r>
+      <w:r>
+        <w:t xml:space="preserve"> Esto implica el diseño de una interfaz de usuario interactiva y responsiva utilizando React, la construcción de una </w:t>
       </w:r>
       <w:r>
         <w:lastRenderedPageBreak/>
         <w:t>sólida lógica de servidor (</w:t>
       </w:r>
-      <w:proofErr w:type="spellStart"/>
-      <w:r>
-        <w:t>backend</w:t>
-      </w:r>
-      <w:proofErr w:type="spellEnd"/>
-      <w:r>
-        <w:t>)</w:t>
+      <w:r>
+        <w:t>backend)</w:t>
       </w:r>
       <w:r>
         <w:t xml:space="preserve"> implementada en Spring Boot, y el modelado estricto de una base de datos relacional compartida, donde la Célula 1 aportará exactamente cinco tablas de negocio debidamente normalizadas. Asimismo, el desarrollo estará regido por prácticas de control de versiones y se integrará obligatoriamente con el módulo transversal de Usuarios y Autenticación (Módulo 00) mediante tokens JWT, asegurando así la protección de los datos y el cumplimiento de los estándares de seguridad de la arquitectura.</w:t>
@@ -1936,11 +1894,9 @@
       <w:r>
         <w:t xml:space="preserve">El propósito principal de este informe de requisitos es establecer de manera exhaustiva y clara las directrices, alcances, responsabilidades y componentes técnicos que la Célula 1 deberá construir. A través de este documento, se busca alinear la visión del equipo de desarrollo con los objetivos de negocio de Grupo Nutresa, sirviendo como hoja de ruta para el diseño del modelo de datos, la planificación de los </w:t>
       </w:r>
-      <w:proofErr w:type="spellStart"/>
       <w:r>
         <w:t>endpoints</w:t>
       </w:r>
-      <w:proofErr w:type="spellEnd"/>
       <w:r>
         <w:t xml:space="preserve"> y la creación de la experiencia visual, asegurando que el módulo se ensamble a la perfección con el resto de la plataforma </w:t>
       </w:r>
@@ -1979,25 +1935,24 @@
     </w:p>
     <w:p>
       <w:pPr>
-        <w:rPr>
-          <w:rFonts w:cs="Times New Roman"/>
-        </w:rPr>
-      </w:pPr>
-    </w:p>
-    <w:p>
-      <w:pPr>
-        <w:pStyle w:val="Ttulo1"/>
-        <w:rPr>
-          <w:rFonts w:cs="Times New Roman"/>
-          <w:szCs w:val="24"/>
-        </w:rPr>
-      </w:pPr>
-    </w:p>
-    <w:p>
-      <w:pPr>
         <w:pStyle w:val="Ttulo2"/>
       </w:pPr>
       <w:bookmarkStart w:id="5" w:name="_Toc241954132"/>
+    </w:p>
+    <w:p>
+      <w:pPr>
+        <w:pStyle w:val="Ttulo2"/>
+      </w:pPr>
+    </w:p>
+    <w:p>
+      <w:pPr>
+        <w:pStyle w:val="Ttulo2"/>
+      </w:pPr>
+    </w:p>
+    <w:p>
+      <w:pPr>
+        <w:pStyle w:val="Ttulo2"/>
+      </w:pPr>
       <w:r>
         <w:t>Objetivo</w:t>
       </w:r>
@@ -2055,21 +2010,7 @@
         <w:rPr>
           <w:lang w:eastAsia="es-CO"/>
         </w:rPr>
-        <w:t xml:space="preserve">Documentar los requisitos funcionales y no funcionales del módulo, especificando el filtrado, la visualización y las operaciones CRUD gestionadas con </w:t>
-      </w:r>
-      <w:proofErr w:type="spellStart"/>
-      <w:r>
-        <w:rPr>
-          <w:lang w:eastAsia="es-CO"/>
-        </w:rPr>
-        <w:t>React</w:t>
-      </w:r>
-      <w:proofErr w:type="spellEnd"/>
-      <w:r>
-        <w:rPr>
-          <w:lang w:eastAsia="es-CO"/>
-        </w:rPr>
-        <w:t xml:space="preserve"> y Local Storage.</w:t>
+        <w:t>Documentar los requisitos funcionales y no funcionales del módulo, especificando el filtrado, la visualización y las operaciones CRUD gestionadas con React y Local Storage.</w:t>
       </w:r>
     </w:p>
     <w:p>
@@ -2139,81 +2080,30 @@
     <w:p/>
     <w:p>
       <w:r>
-        <w:t>En el desarrollo de plataformas culinarias, la carencia de un repositorio centralizado de ingredientes comerciales genera inconsistencias en la estructuración de las recetas y dificulta la estandarización de los datos entre los distintos módulos del sistema. Actualmente, la gestión fragmentada de marcas y categorías impide una integración arquitectónica eficiente, evidenciando la necesidad urgente de un registro maestro unificado.</w:t>
-      </w:r>
-    </w:p>
-    <w:p>
-      <w:r>
-        <w:t xml:space="preserve">Para resolver esta problemática, se define la Célula 1 del aplicativo Sazón, enfocada en el desarrollo del módulo "Catálogo de Productos Nutresa" (Equipo de Desarrollo Sazón, 2026). Este componente actúa como la base técnica del recetario, consolidando el portafolio del Grupo Nutresa (Zenú, Noel, Doria, </w:t>
-      </w:r>
-      <w:proofErr w:type="spellStart"/>
-      <w:r>
-        <w:t>Colcafé</w:t>
-      </w:r>
-      <w:proofErr w:type="spellEnd"/>
-      <w:r>
-        <w:t xml:space="preserve">, </w:t>
-      </w:r>
-      <w:proofErr w:type="spellStart"/>
-      <w:r>
-        <w:t>Chocolisto</w:t>
-      </w:r>
-      <w:proofErr w:type="spellEnd"/>
-      <w:r>
-        <w:t xml:space="preserve">, Jet y Ranchera) para que funcione como la fuente única de verdad sobre la cual se estructura cada receta. </w:t>
-      </w:r>
-    </w:p>
-    <w:p/>
-    <w:p>
-      <w:r>
-        <w:t xml:space="preserve">La solución tecnológica se articula en tres capas: un </w:t>
-      </w:r>
-      <w:proofErr w:type="spellStart"/>
-      <w:r>
-        <w:rPr>
-          <w:i/>
-          <w:iCs/>
-        </w:rPr>
-        <w:t>frontend</w:t>
-      </w:r>
-      <w:proofErr w:type="spellEnd"/>
-      <w:r>
-        <w:t xml:space="preserve"> (</w:t>
-      </w:r>
-      <w:proofErr w:type="spellStart"/>
-      <w:r>
-        <w:t>React</w:t>
-      </w:r>
-      <w:proofErr w:type="spellEnd"/>
-      <w:r>
-        <w:t xml:space="preserve">) que despliega una vitrina interactiva con filtros y fichas detalladas de los productos; un </w:t>
-      </w:r>
-      <w:proofErr w:type="spellStart"/>
-      <w:r>
-        <w:rPr>
-          <w:i/>
-          <w:iCs/>
-        </w:rPr>
-        <w:t>backend</w:t>
-      </w:r>
-      <w:proofErr w:type="spellEnd"/>
-      <w:r>
-        <w:t xml:space="preserve"> (Spring Boot) que gestiona el inventario completo (CRUD) y expone </w:t>
-      </w:r>
-      <w:proofErr w:type="spellStart"/>
-      <w:r>
-        <w:rPr>
-          <w:i/>
-          <w:iCs/>
-        </w:rPr>
-        <w:t>endpoints</w:t>
-      </w:r>
-      <w:proofErr w:type="spellEnd"/>
-      <w:r>
-        <w:t xml:space="preserve"> de consulta esenciales para las demás células del proyecto; y una base de datos relacional de cinco tablas que soporta la persistencia, edición y búsqueda de todos los elementos del catálogo (Equipo de Desarrollo Sazón, 2026).</w:t>
-      </w:r>
-    </w:p>
-    <w:p>
+        <w:t>En el desarrollo de plataformas culinarias, la carencia de un repositorio centralizado de ingredientes genera inconsistencias al estructurar recetas y dificulta la estandarización de datos entre los módulos del sistema. Actualmente, la gestión fragmentada de marcas impide una integración arquitectónica eficiente, evidenciando la necesidad de un registro maestro unificado.</w:t>
+      </w:r>
+    </w:p>
+    <w:p>
+      <w:r>
+        <w:t>Para resolver esta problemática, se define la Célula 1 del aplicativo Sazón, enfocada en el módulo "Catálogo de Productos Nutresa</w:t>
+      </w:r>
+      <w:r>
+        <w:t xml:space="preserve">”. </w:t>
+      </w:r>
+      <w:r>
+        <w:t>Este componente actúa como base técnica del recetario, consolidando el portafolio del Grupo Nutresa (Zenú, Noel, Doria, Colcafé, Chocolisto, Jet y Ranchera) como la fuente única de verdad para estructurar cada receta.</w:t>
+      </w:r>
+    </w:p>
+    <w:p>
+      <w:r>
+        <w:t xml:space="preserve">La solución tecnológica emplea una arquitectura web con almacenamiento descentralizado. Mediante React, se despliega una vitrina interactiva con filtros y fichas detalladas, gestionando las operaciones del catálogo (CRUD) bajo patrones de diseño desacoplados. La persistencia se centraliza en el Local Storage del navegador, estructurando conceptualmente los datos con un modelo relacional UML de cinco tablas (productos, marcas, clasificaciones, tamaños y fotografías). Al mantener una estructura de datos estandarizada en formato JSON, se garantiza la interoperabilidad técnica, permitiendo que el catálogo funcione de forma independiente como maestro de productos de consulta local para las demás células </w:t>
+      </w:r>
+    </w:p>
+    <w:p>
+      <w:pPr>
+        <w:spacing w:after="160" w:line="278" w:lineRule="auto"/>
+        <w:ind w:firstLine="0"/>
+      </w:pPr>
       <w:r>
         <w:br w:type="page"/>
       </w:r>
@@ -2494,7 +2384,6 @@
             <w:r>
               <w:t xml:space="preserve">Desarrollo de una vitrina interactiva en el </w:t>
             </w:r>
-            <w:proofErr w:type="spellStart"/>
             <w:r>
               <w:rPr>
                 <w:i/>
@@ -2502,7 +2391,6 @@
               </w:rPr>
               <w:t>frontend</w:t>
             </w:r>
-            <w:proofErr w:type="spellEnd"/>
             <w:r>
               <w:t xml:space="preserve"> con filtros por categoría, presentación o marca, y una ficha detallada por cada producto.</w:t>
             </w:r>
@@ -2553,31 +2441,10 @@
               <w:pStyle w:val="textotablas"/>
             </w:pPr>
             <w:r>
-              <w:t xml:space="preserve">Implementación de un </w:t>
-            </w:r>
-            <w:proofErr w:type="spellStart"/>
-            <w:r>
-              <w:rPr>
-                <w:i/>
-                <w:iCs/>
-              </w:rPr>
-              <w:t>backend</w:t>
-            </w:r>
-            <w:proofErr w:type="spellEnd"/>
-            <w:r>
-              <w:t xml:space="preserve"> que gestiona el ciclo de vida del catálogo (CRUD) y expone </w:t>
-            </w:r>
-            <w:proofErr w:type="spellStart"/>
-            <w:r>
-              <w:rPr>
-                <w:i/>
-                <w:iCs/>
-              </w:rPr>
-              <w:t>endpoints</w:t>
-            </w:r>
-            <w:proofErr w:type="spellEnd"/>
-            <w:r>
-              <w:t xml:space="preserve"> de consulta estandarizados para que las demás células consuman la información.</w:t>
+              <w:t>I</w:t>
+            </w:r>
+            <w:r>
+              <w:t>mplementación de operaciones CRUD en Local Storage y definición de datos en JSON, sirviendo como contrato interoperable.</w:t>
             </w:r>
           </w:p>
         </w:tc>
@@ -2585,98 +2452,26 @@
     </w:tbl>
     <w:p>
       <w:pPr>
-        <w:pStyle w:val="Estilonotastabla"/>
         <w:ind w:firstLine="0"/>
-      </w:pPr>
-      <w:r>
         <w:rPr>
           <w:i/>
+          <w:iCs/>
+        </w:rPr>
+      </w:pPr>
+    </w:p>
+    <w:p>
+      <w:pPr>
+        <w:ind w:firstLine="0"/>
+      </w:pPr>
+      <w:r>
+        <w:rPr>
+          <w:i/>
+          <w:iCs/>
         </w:rPr>
         <w:t>Nota.</w:t>
       </w:r>
       <w:r>
-        <w:t xml:space="preserve"> Tabla generada mediante el modelo de lenguaje grande Gemini (Google, 2026), basada en los requerimientos funcionales de la Célula 1 de la aplicación Sazón (Equipo de Desarrollo Sazón, 2026). El acrónimo CRUD (</w:t>
-      </w:r>
-      <w:proofErr w:type="spellStart"/>
-      <w:r>
-        <w:rPr>
-          <w:i/>
-        </w:rPr>
-        <w:t>Create</w:t>
-      </w:r>
-      <w:proofErr w:type="spellEnd"/>
-      <w:r>
-        <w:rPr>
-          <w:i/>
-        </w:rPr>
-        <w:t xml:space="preserve">, Read, </w:t>
-      </w:r>
-      <w:proofErr w:type="spellStart"/>
-      <w:r>
-        <w:rPr>
-          <w:i/>
-        </w:rPr>
-        <w:t>Update</w:t>
-      </w:r>
-      <w:proofErr w:type="spellEnd"/>
-      <w:r>
-        <w:rPr>
-          <w:i/>
-        </w:rPr>
-        <w:t>, Delete</w:t>
-      </w:r>
-      <w:r>
-        <w:t xml:space="preserve">) engloba las operaciones básicas de gestión en bases de datos, mientras que el término </w:t>
-      </w:r>
-      <w:proofErr w:type="spellStart"/>
-      <w:r>
-        <w:rPr>
-          <w:i/>
-        </w:rPr>
-        <w:t>endpoint</w:t>
-      </w:r>
-      <w:proofErr w:type="spellEnd"/>
-      <w:r>
-        <w:t xml:space="preserve"> hace referencia a los puntos de acceso de la API (</w:t>
-      </w:r>
-      <w:proofErr w:type="spellStart"/>
-      <w:r>
-        <w:rPr>
-          <w:i/>
-        </w:rPr>
-        <w:t>Application</w:t>
-      </w:r>
-      <w:proofErr w:type="spellEnd"/>
-      <w:r>
-        <w:rPr>
-          <w:i/>
-        </w:rPr>
-        <w:t xml:space="preserve"> </w:t>
-      </w:r>
-      <w:proofErr w:type="spellStart"/>
-      <w:r>
-        <w:rPr>
-          <w:i/>
-        </w:rPr>
-        <w:t>Programming</w:t>
-      </w:r>
-      <w:proofErr w:type="spellEnd"/>
-      <w:r>
-        <w:rPr>
-          <w:i/>
-        </w:rPr>
-        <w:t xml:space="preserve"> </w:t>
-      </w:r>
-      <w:proofErr w:type="gramStart"/>
-      <w:r>
-        <w:rPr>
-          <w:i/>
-        </w:rPr>
-        <w:t>Interface</w:t>
-      </w:r>
-      <w:proofErr w:type="gramEnd"/>
-      <w:r>
-        <w:t>) que permiten a los demás módulos de la aplicación comunicarse y consultar la información centralizada del catálogo.</w:t>
+        <w:t xml:space="preserve"> Basado en los requerimientos de la Célula 1 (Equipo de Desarrollo Sazón, 2026). El acrónimo CRUD engloba las operaciones básicas de gestión de datos. La interoperabilidad se resuelve modelando la lógica de negocio en UML, pero materializando el acceso de forma desacoplada mediante objetos JSON en el navegador.</w:t>
       </w:r>
     </w:p>
     <w:p>
@@ -2768,27 +2563,7 @@
           <w:szCs w:val="22"/>
           <w:lang w:eastAsia="es-CO"/>
         </w:rPr>
-        <w:t>La solución full-</w:t>
-      </w:r>
-      <w:proofErr w:type="spellStart"/>
-      <w:r>
-        <w:rPr>
-          <w:rFonts w:eastAsia="Calibri" w:cs="Times New Roman"/>
-          <w:color w:val="000000"/>
-          <w:szCs w:val="22"/>
-          <w:lang w:eastAsia="es-CO"/>
-        </w:rPr>
-        <w:t>stack</w:t>
-      </w:r>
-      <w:proofErr w:type="spellEnd"/>
-      <w:r>
-        <w:rPr>
-          <w:rFonts w:eastAsia="Calibri" w:cs="Times New Roman"/>
-          <w:color w:val="000000"/>
-          <w:szCs w:val="22"/>
-          <w:lang w:eastAsia="es-CO"/>
-        </w:rPr>
-        <w:t xml:space="preserve"> para el </w:t>
+        <w:t xml:space="preserve">La solución full-stack para el </w:t>
       </w:r>
       <w:r>
         <w:rPr>
@@ -2820,21 +2595,12 @@
         </w:rPr>
       </w:pPr>
       <w:bookmarkStart w:id="10" w:name="_Toc241954136"/>
-      <w:proofErr w:type="spellStart"/>
       <w:r>
         <w:rPr>
           <w:rFonts w:eastAsia="Times New Roman"/>
           <w:lang w:eastAsia="es-CO"/>
         </w:rPr>
-        <w:t>Frontend</w:t>
-      </w:r>
-      <w:proofErr w:type="spellEnd"/>
-      <w:r>
-        <w:rPr>
-          <w:rFonts w:eastAsia="Times New Roman"/>
-          <w:lang w:eastAsia="es-CO"/>
-        </w:rPr>
-        <w:t xml:space="preserve"> (Capa de Presentación)</w:t>
+        <w:t>Frontend (Capa de Presentación)</w:t>
       </w:r>
       <w:bookmarkEnd w:id="10"/>
     </w:p>
@@ -2852,7 +2618,6 @@
           <w:lang w:eastAsia="es-CO"/>
         </w:rPr>
       </w:pPr>
-      <w:proofErr w:type="spellStart"/>
       <w:r>
         <w:rPr>
           <w:rFonts w:eastAsia="Calibri" w:cs="Times New Roman"/>
@@ -2862,9 +2627,32 @@
           <w:szCs w:val="22"/>
           <w:lang w:eastAsia="es-CO"/>
         </w:rPr>
-        <w:t>React</w:t>
-      </w:r>
-      <w:proofErr w:type="spellEnd"/>
+        <w:t>React:</w:t>
+      </w:r>
+      <w:r>
+        <w:rPr>
+          <w:rFonts w:eastAsia="Calibri" w:cs="Times New Roman"/>
+          <w:color w:val="000000"/>
+          <w:szCs w:val="22"/>
+          <w:lang w:eastAsia="es-CO"/>
+        </w:rPr>
+        <w:t xml:space="preserve"> Librería/Framework para la construcción de una interfaz dinámica Single Page Application (SPA), enfocada en la vitrina comercial y búsqueda de productos.</w:t>
+      </w:r>
+    </w:p>
+    <w:p>
+      <w:pPr>
+        <w:pStyle w:val="Prrafodelista"/>
+        <w:numPr>
+          <w:ilvl w:val="0"/>
+          <w:numId w:val="9"/>
+        </w:numPr>
+        <w:rPr>
+          <w:rFonts w:eastAsia="Calibri" w:cs="Times New Roman"/>
+          <w:color w:val="000000"/>
+          <w:szCs w:val="22"/>
+          <w:lang w:eastAsia="es-CO"/>
+        </w:rPr>
+      </w:pPr>
       <w:r>
         <w:rPr>
           <w:rFonts w:eastAsia="Calibri" w:cs="Times New Roman"/>
@@ -2874,7 +2662,7 @@
           <w:szCs w:val="22"/>
           <w:lang w:eastAsia="es-CO"/>
         </w:rPr>
-        <w:t>:</w:t>
+        <w:t>JavaScript (ES6+) / HTML5 / CSS3:</w:t>
       </w:r>
       <w:r>
         <w:rPr>
@@ -2883,47 +2671,7 @@
           <w:szCs w:val="22"/>
           <w:lang w:eastAsia="es-CO"/>
         </w:rPr>
-        <w:t xml:space="preserve"> Librería/Framework para la construcción de una interfaz dinámica </w:t>
-      </w:r>
-      <w:proofErr w:type="gramStart"/>
-      <w:r>
-        <w:rPr>
-          <w:rFonts w:eastAsia="Calibri" w:cs="Times New Roman"/>
-          <w:color w:val="000000"/>
-          <w:szCs w:val="22"/>
-          <w:lang w:eastAsia="es-CO"/>
-        </w:rPr>
-        <w:t>Single</w:t>
-      </w:r>
-      <w:proofErr w:type="gramEnd"/>
-      <w:r>
-        <w:rPr>
-          <w:rFonts w:eastAsia="Calibri" w:cs="Times New Roman"/>
-          <w:color w:val="000000"/>
-          <w:szCs w:val="22"/>
-          <w:lang w:eastAsia="es-CO"/>
-        </w:rPr>
-        <w:t xml:space="preserve"> Page </w:t>
-      </w:r>
-      <w:proofErr w:type="spellStart"/>
-      <w:r>
-        <w:rPr>
-          <w:rFonts w:eastAsia="Calibri" w:cs="Times New Roman"/>
-          <w:color w:val="000000"/>
-          <w:szCs w:val="22"/>
-          <w:lang w:eastAsia="es-CO"/>
-        </w:rPr>
-        <w:t>Application</w:t>
-      </w:r>
-      <w:proofErr w:type="spellEnd"/>
-      <w:r>
-        <w:rPr>
-          <w:rFonts w:eastAsia="Calibri" w:cs="Times New Roman"/>
-          <w:color w:val="000000"/>
-          <w:szCs w:val="22"/>
-          <w:lang w:eastAsia="es-CO"/>
-        </w:rPr>
-        <w:t xml:space="preserve"> (SPA), enfocada en la vitrina comercial y búsqueda de productos.</w:t>
+        <w:t xml:space="preserve"> Lenguajes estándar para lógica de interfaz, maquetación semántica y estilos adaptables.</w:t>
       </w:r>
     </w:p>
     <w:p>
@@ -2949,7 +2697,7 @@
           <w:szCs w:val="22"/>
           <w:lang w:eastAsia="es-CO"/>
         </w:rPr>
-        <w:t>JavaScript (ES6+) / HTML5 / CSS3:</w:t>
+        <w:t>Axios / Fetch API:</w:t>
       </w:r>
       <w:r>
         <w:rPr>
@@ -2958,15 +2706,33 @@
           <w:szCs w:val="22"/>
           <w:lang w:eastAsia="es-CO"/>
         </w:rPr>
-        <w:t xml:space="preserve"> Lenguajes estándar para lógica de interfaz, maquetación semántica y estilos adaptables.</w:t>
-      </w:r>
+        <w:t xml:space="preserve"> Consumo de la API REST backend mediante peticiones HTTP asíncronas.</w:t>
+      </w:r>
+    </w:p>
+    <w:p>
+      <w:pPr>
+        <w:pStyle w:val="Ttulo2"/>
+        <w:rPr>
+          <w:rFonts w:eastAsia="Times New Roman"/>
+          <w:lang w:eastAsia="es-CO"/>
+        </w:rPr>
+      </w:pPr>
+      <w:bookmarkStart w:id="11" w:name="_Toc241954137"/>
+      <w:r>
+        <w:rPr>
+          <w:rFonts w:eastAsia="Times New Roman"/>
+          <w:lang w:eastAsia="es-CO"/>
+        </w:rPr>
+        <w:t>Backend (Capa de Lógica de Negocio)</w:t>
+      </w:r>
+      <w:bookmarkEnd w:id="11"/>
     </w:p>
     <w:p>
       <w:pPr>
         <w:pStyle w:val="Prrafodelista"/>
         <w:numPr>
           <w:ilvl w:val="0"/>
-          <w:numId w:val="9"/>
+          <w:numId w:val="10"/>
         </w:numPr>
         <w:rPr>
           <w:rFonts w:eastAsia="Calibri" w:cs="Times New Roman"/>
@@ -2984,7 +2750,7 @@
           <w:szCs w:val="22"/>
           <w:lang w:eastAsia="es-CO"/>
         </w:rPr>
-        <w:t>Axios / Fetch API:</w:t>
+        <w:t>Java:</w:t>
       </w:r>
       <w:r>
         <w:rPr>
@@ -2993,55 +2759,8 @@
           <w:szCs w:val="22"/>
           <w:lang w:eastAsia="es-CO"/>
         </w:rPr>
-        <w:t xml:space="preserve"> Consumo de la API REST </w:t>
-      </w:r>
-      <w:proofErr w:type="spellStart"/>
-      <w:r>
-        <w:rPr>
-          <w:rFonts w:eastAsia="Calibri" w:cs="Times New Roman"/>
-          <w:color w:val="000000"/>
-          <w:szCs w:val="22"/>
-          <w:lang w:eastAsia="es-CO"/>
-        </w:rPr>
-        <w:t>backend</w:t>
-      </w:r>
-      <w:proofErr w:type="spellEnd"/>
-      <w:r>
-        <w:rPr>
-          <w:rFonts w:eastAsia="Calibri" w:cs="Times New Roman"/>
-          <w:color w:val="000000"/>
-          <w:szCs w:val="22"/>
-          <w:lang w:eastAsia="es-CO"/>
-        </w:rPr>
-        <w:t xml:space="preserve"> mediante peticiones HTTP asíncronas.</w:t>
-      </w:r>
-    </w:p>
-    <w:p>
-      <w:pPr>
-        <w:pStyle w:val="Ttulo2"/>
-        <w:rPr>
-          <w:rFonts w:eastAsia="Times New Roman"/>
-          <w:lang w:eastAsia="es-CO"/>
-        </w:rPr>
-      </w:pPr>
-      <w:bookmarkStart w:id="11" w:name="_Toc241954137"/>
-      <w:proofErr w:type="spellStart"/>
-      <w:r>
-        <w:rPr>
-          <w:rFonts w:eastAsia="Times New Roman"/>
-          <w:lang w:eastAsia="es-CO"/>
-        </w:rPr>
-        <w:t>Backend</w:t>
-      </w:r>
-      <w:proofErr w:type="spellEnd"/>
-      <w:r>
-        <w:rPr>
-          <w:rFonts w:eastAsia="Times New Roman"/>
-          <w:lang w:eastAsia="es-CO"/>
-        </w:rPr>
-        <w:t xml:space="preserve"> (Capa de Lógica de Negocio)</w:t>
-      </w:r>
-      <w:bookmarkEnd w:id="11"/>
+        <w:t xml:space="preserve"> Lenguaje de programación orientado a objetos para la lógica del servidor.</w:t>
+      </w:r>
     </w:p>
     <w:p>
       <w:pPr>
@@ -3066,7 +2785,7 @@
           <w:szCs w:val="22"/>
           <w:lang w:eastAsia="es-CO"/>
         </w:rPr>
-        <w:t>Java:</w:t>
+        <w:t>Spring Boot:</w:t>
       </w:r>
       <w:r>
         <w:rPr>
@@ -3075,7 +2794,7 @@
           <w:szCs w:val="22"/>
           <w:lang w:eastAsia="es-CO"/>
         </w:rPr>
-        <w:t xml:space="preserve"> Lenguaje de programación orientado a objetos para la lógica del servidor.</w:t>
+        <w:t xml:space="preserve"> Framework para el desarrollo de controladores REST, servicios y lógica de consulta, filtrado y paginación de productos.</w:t>
       </w:r>
     </w:p>
     <w:p>
@@ -3101,7 +2820,7 @@
           <w:szCs w:val="22"/>
           <w:lang w:eastAsia="es-CO"/>
         </w:rPr>
-        <w:t>Spring Boot:</w:t>
+        <w:t>Spring Security &amp; JWT:</w:t>
       </w:r>
       <w:r>
         <w:rPr>
@@ -3110,20 +2829,131 @@
           <w:szCs w:val="22"/>
           <w:lang w:eastAsia="es-CO"/>
         </w:rPr>
-        <w:t xml:space="preserve"> Framework para el desarrollo de controladores REST, servicios y lógica de consulta, filtrado y paginación de productos.</w:t>
-      </w:r>
+        <w:t xml:space="preserve"> Decodificación y validación de tokens Bearer para proteger endpoints administrativos (como la creación y modificación de productos).</w:t>
+      </w:r>
+    </w:p>
+    <w:p>
+      <w:pPr>
+        <w:rPr>
+          <w:rFonts w:eastAsia="Calibri" w:cs="Times New Roman"/>
+          <w:color w:val="000000"/>
+          <w:szCs w:val="22"/>
+          <w:lang w:eastAsia="es-CO"/>
+        </w:rPr>
+      </w:pPr>
+    </w:p>
+    <w:p>
+      <w:pPr>
+        <w:rPr>
+          <w:rFonts w:eastAsia="Calibri" w:cs="Times New Roman"/>
+          <w:color w:val="000000"/>
+          <w:szCs w:val="22"/>
+          <w:lang w:eastAsia="es-CO"/>
+        </w:rPr>
+      </w:pPr>
+    </w:p>
+    <w:p>
+      <w:pPr>
+        <w:pStyle w:val="Ttulo2"/>
+        <w:rPr>
+          <w:rFonts w:eastAsia="Calibri"/>
+          <w:lang w:eastAsia="es-CO"/>
+        </w:rPr>
+      </w:pPr>
+    </w:p>
+    <w:p>
+      <w:pPr>
+        <w:pStyle w:val="Ttulo2"/>
+        <w:rPr>
+          <w:rFonts w:eastAsia="Times New Roman"/>
+          <w:lang w:eastAsia="es-CO"/>
+        </w:rPr>
+      </w:pPr>
+      <w:bookmarkStart w:id="12" w:name="_Toc241954138"/>
+      <w:r>
+        <w:rPr>
+          <w:rFonts w:eastAsia="Times New Roman"/>
+          <w:lang w:eastAsia="es-CO"/>
+        </w:rPr>
+        <w:t>Base de Datos y Persistencia (Capa de Datos)</w:t>
+      </w:r>
+      <w:bookmarkEnd w:id="12"/>
     </w:p>
     <w:p>
       <w:pPr>
         <w:pStyle w:val="Prrafodelista"/>
         <w:numPr>
           <w:ilvl w:val="0"/>
-          <w:numId w:val="10"/>
+          <w:numId w:val="11"/>
         </w:numPr>
         <w:rPr>
           <w:rFonts w:eastAsia="Calibri" w:cs="Times New Roman"/>
           <w:color w:val="000000"/>
           <w:szCs w:val="22"/>
+          <w:lang w:eastAsia="es-CO"/>
+        </w:rPr>
+      </w:pPr>
+      <w:r>
+        <w:rPr>
+          <w:rFonts w:eastAsia="Calibri" w:cs="Times New Roman"/>
+          <w:color w:val="000000"/>
+          <w:szCs w:val="22"/>
+          <w:lang w:eastAsia="es-CO"/>
+        </w:rPr>
+        <w:t>Motor Relacional SQL (PostgreSQL / MySQL): Instancia de base de datos compartida.</w:t>
+      </w:r>
+    </w:p>
+    <w:p>
+      <w:pPr>
+        <w:pStyle w:val="Prrafodelista"/>
+        <w:numPr>
+          <w:ilvl w:val="0"/>
+          <w:numId w:val="11"/>
+        </w:numPr>
+        <w:rPr>
+          <w:rFonts w:eastAsia="Calibri" w:cs="Times New Roman"/>
+          <w:color w:val="000000"/>
+          <w:szCs w:val="22"/>
+          <w:lang w:eastAsia="es-CO"/>
+        </w:rPr>
+      </w:pPr>
+      <w:r>
+        <w:rPr>
+          <w:rFonts w:eastAsia="Calibri" w:cs="Times New Roman"/>
+          <w:color w:val="000000"/>
+          <w:szCs w:val="22"/>
+          <w:lang w:eastAsia="es-CO"/>
+        </w:rPr>
+        <w:t>Spring Data JPA / Hibernate: Mapeo objeto-relacional (ORM) para ejecutar operaciones CRUD y gestionar las 5 tablas asignadas a la Célula 1.</w:t>
+      </w:r>
+    </w:p>
+    <w:p>
+      <w:pPr>
+        <w:pStyle w:val="Ttulo2"/>
+        <w:rPr>
+          <w:rFonts w:eastAsia="Times New Roman"/>
+          <w:lang w:eastAsia="es-CO"/>
+        </w:rPr>
+      </w:pPr>
+      <w:bookmarkStart w:id="13" w:name="_Toc241954139"/>
+      <w:r>
+        <w:rPr>
+          <w:rFonts w:eastAsia="Times New Roman"/>
+          <w:lang w:eastAsia="es-CO"/>
+        </w:rPr>
+        <w:t>Herramientas de Soporte y Control de Versiones</w:t>
+      </w:r>
+      <w:bookmarkEnd w:id="13"/>
+    </w:p>
+    <w:p>
+      <w:pPr>
+        <w:pStyle w:val="Prrafodelista"/>
+        <w:numPr>
+          <w:ilvl w:val="0"/>
+          <w:numId w:val="13"/>
+        </w:numPr>
+        <w:rPr>
+          <w:rStyle w:val="EstilonotastablaCar"/>
           <w:lang w:eastAsia="es-CO"/>
         </w:rPr>
       </w:pPr>
@@ -3136,7 +2966,7 @@
           <w:szCs w:val="22"/>
           <w:lang w:eastAsia="es-CO"/>
         </w:rPr>
-        <w:t>Spring Security &amp; JWT:</w:t>
+        <w:t>Git &amp; GitHub:</w:t>
       </w:r>
       <w:r>
         <w:rPr>
@@ -3145,161 +2975,15 @@
           <w:szCs w:val="22"/>
           <w:lang w:eastAsia="es-CO"/>
         </w:rPr>
-        <w:t xml:space="preserve"> Decodificación y validación de tokens Bearer para proteger </w:t>
-      </w:r>
-      <w:proofErr w:type="spellStart"/>
-      <w:r>
-        <w:rPr>
-          <w:rFonts w:eastAsia="Calibri" w:cs="Times New Roman"/>
-          <w:color w:val="000000"/>
-          <w:szCs w:val="22"/>
+        <w:t xml:space="preserve"> Control de versiones distribuido bajo flujo de trabajo por ramas por célula (</w:t>
+      </w:r>
+      <w:r>
+        <w:rPr>
+          <w:rStyle w:val="EstilonotastablaCar"/>
           <w:lang w:eastAsia="es-CO"/>
         </w:rPr>
-        <w:t>endpoints</w:t>
-      </w:r>
-      <w:proofErr w:type="spellEnd"/>
-      <w:r>
-        <w:rPr>
-          <w:rFonts w:eastAsia="Calibri" w:cs="Times New Roman"/>
-          <w:color w:val="000000"/>
-          <w:szCs w:val="22"/>
-          <w:lang w:eastAsia="es-CO"/>
-        </w:rPr>
-        <w:t xml:space="preserve"> administrativos (como la creación y modificación de productos).</w:t>
-      </w:r>
-    </w:p>
-    <w:p>
-      <w:pPr>
-        <w:rPr>
-          <w:rFonts w:eastAsia="Calibri" w:cs="Times New Roman"/>
-          <w:color w:val="000000"/>
-          <w:szCs w:val="22"/>
-          <w:lang w:eastAsia="es-CO"/>
-        </w:rPr>
-      </w:pPr>
-    </w:p>
-    <w:p>
-      <w:pPr>
-        <w:rPr>
-          <w:rFonts w:eastAsia="Calibri" w:cs="Times New Roman"/>
-          <w:color w:val="000000"/>
-          <w:szCs w:val="22"/>
-          <w:lang w:eastAsia="es-CO"/>
-        </w:rPr>
-      </w:pPr>
-    </w:p>
-    <w:p>
-      <w:pPr>
-        <w:pStyle w:val="Ttulo2"/>
-        <w:rPr>
-          <w:rFonts w:eastAsia="Calibri"/>
-          <w:lang w:eastAsia="es-CO"/>
-        </w:rPr>
-      </w:pPr>
-    </w:p>
-    <w:p>
-      <w:pPr>
-        <w:pStyle w:val="Ttulo2"/>
-        <w:rPr>
-          <w:rFonts w:eastAsia="Times New Roman"/>
-          <w:lang w:eastAsia="es-CO"/>
-        </w:rPr>
-      </w:pPr>
-      <w:bookmarkStart w:id="12" w:name="_Toc241954138"/>
-      <w:r>
-        <w:rPr>
-          <w:rFonts w:eastAsia="Times New Roman"/>
-          <w:lang w:eastAsia="es-CO"/>
-        </w:rPr>
-        <w:t>Base de Datos y Persistencia (Capa de Datos)</w:t>
-      </w:r>
-      <w:bookmarkEnd w:id="12"/>
-    </w:p>
-    <w:p>
-      <w:pPr>
-        <w:pStyle w:val="Prrafodelista"/>
-        <w:numPr>
-          <w:ilvl w:val="0"/>
-          <w:numId w:val="11"/>
-        </w:numPr>
-        <w:rPr>
-          <w:rFonts w:eastAsia="Calibri" w:cs="Times New Roman"/>
-          <w:color w:val="000000"/>
-          <w:szCs w:val="22"/>
-          <w:lang w:eastAsia="es-CO"/>
-        </w:rPr>
-      </w:pPr>
-      <w:r>
-        <w:rPr>
-          <w:rFonts w:eastAsia="Calibri" w:cs="Times New Roman"/>
-          <w:color w:val="000000"/>
-          <w:szCs w:val="22"/>
-          <w:lang w:eastAsia="es-CO"/>
-        </w:rPr>
-        <w:t>Motor Relacional SQL (PostgreSQL / MySQL): Instancia de base de datos compartida.</w:t>
-      </w:r>
-    </w:p>
-    <w:p>
-      <w:pPr>
-        <w:pStyle w:val="Prrafodelista"/>
-        <w:numPr>
-          <w:ilvl w:val="0"/>
-          <w:numId w:val="11"/>
-        </w:numPr>
-        <w:rPr>
-          <w:rFonts w:eastAsia="Calibri" w:cs="Times New Roman"/>
-          <w:color w:val="000000"/>
-          <w:szCs w:val="22"/>
-          <w:lang w:eastAsia="es-CO"/>
-        </w:rPr>
-      </w:pPr>
-      <w:r>
-        <w:rPr>
-          <w:rFonts w:eastAsia="Calibri" w:cs="Times New Roman"/>
-          <w:color w:val="000000"/>
-          <w:szCs w:val="22"/>
-          <w:lang w:eastAsia="es-CO"/>
-        </w:rPr>
-        <w:t xml:space="preserve">Spring Data JPA / </w:t>
-      </w:r>
-      <w:proofErr w:type="spellStart"/>
-      <w:r>
-        <w:rPr>
-          <w:rFonts w:eastAsia="Calibri" w:cs="Times New Roman"/>
-          <w:color w:val="000000"/>
-          <w:szCs w:val="22"/>
-          <w:lang w:eastAsia="es-CO"/>
-        </w:rPr>
-        <w:t>Hibernate</w:t>
-      </w:r>
-      <w:proofErr w:type="spellEnd"/>
-      <w:r>
-        <w:rPr>
-          <w:rFonts w:eastAsia="Calibri" w:cs="Times New Roman"/>
-          <w:color w:val="000000"/>
-          <w:szCs w:val="22"/>
-          <w:lang w:eastAsia="es-CO"/>
-        </w:rPr>
-        <w:t>: Mapeo objeto-relacional (ORM) para ejecutar operaciones CRUD y gestionar las 5 tablas asignadas a la Célula 1.</w:t>
-      </w:r>
-    </w:p>
-    <w:p>
-      <w:pPr>
-        <w:pStyle w:val="Ttulo2"/>
-        <w:rPr>
-          <w:rFonts w:eastAsia="Times New Roman"/>
-          <w:lang w:eastAsia="es-CO"/>
-        </w:rPr>
-      </w:pPr>
-      <w:bookmarkStart w:id="13" w:name="_Toc241954139"/>
-      <w:r>
-        <w:rPr>
-          <w:rFonts w:eastAsia="Times New Roman"/>
-          <w:lang w:eastAsia="es-CO"/>
-        </w:rPr>
-        <w:t>Herramientas de Soporte y Control de Versiones</w:t>
-      </w:r>
-      <w:bookmarkEnd w:id="13"/>
+        <w:t>GitFlow).</w:t>
+      </w:r>
     </w:p>
     <w:p>
       <w:pPr>
@@ -3309,7 +2993,9 @@
           <w:numId w:val="13"/>
         </w:numPr>
         <w:rPr>
-          <w:rStyle w:val="EstilonotastablaCar"/>
+          <w:rFonts w:eastAsia="Calibri" w:cs="Times New Roman"/>
+          <w:color w:val="000000"/>
+          <w:szCs w:val="22"/>
           <w:lang w:eastAsia="es-CO"/>
         </w:rPr>
       </w:pPr>
@@ -3322,7 +3008,7 @@
           <w:szCs w:val="22"/>
           <w:lang w:eastAsia="es-CO"/>
         </w:rPr>
-        <w:t>Git &amp; GitHub:</w:t>
+        <w:t>Postman:</w:t>
       </w:r>
       <w:r>
         <w:rPr>
@@ -3331,23 +3017,7 @@
           <w:szCs w:val="22"/>
           <w:lang w:eastAsia="es-CO"/>
         </w:rPr>
-        <w:t xml:space="preserve"> Control de versiones distribuido bajo flujo de trabajo por ramas por célula (</w:t>
-      </w:r>
-      <w:proofErr w:type="spellStart"/>
-      <w:r>
-        <w:rPr>
-          <w:rStyle w:val="EstilonotastablaCar"/>
-          <w:lang w:eastAsia="es-CO"/>
-        </w:rPr>
-        <w:t>GitFlow</w:t>
-      </w:r>
-      <w:proofErr w:type="spellEnd"/>
-      <w:r>
-        <w:rPr>
-          <w:rStyle w:val="EstilonotastablaCar"/>
-          <w:lang w:eastAsia="es-CO"/>
-        </w:rPr>
-        <w:t>).</w:t>
+        <w:t xml:space="preserve"> Pruebas y validación de contratos JSON de los endpoints de la API.</w:t>
       </w:r>
     </w:p>
     <w:p>
@@ -3373,61 +3043,6 @@
           <w:szCs w:val="22"/>
           <w:lang w:eastAsia="es-CO"/>
         </w:rPr>
-        <w:t>Postman:</w:t>
-      </w:r>
-      <w:r>
-        <w:rPr>
-          <w:rFonts w:eastAsia="Calibri" w:cs="Times New Roman"/>
-          <w:color w:val="000000"/>
-          <w:szCs w:val="22"/>
-          <w:lang w:eastAsia="es-CO"/>
-        </w:rPr>
-        <w:t xml:space="preserve"> Pruebas y validación de contratos JSON de los </w:t>
-      </w:r>
-      <w:proofErr w:type="spellStart"/>
-      <w:r>
-        <w:rPr>
-          <w:rFonts w:eastAsia="Calibri" w:cs="Times New Roman"/>
-          <w:color w:val="000000"/>
-          <w:szCs w:val="22"/>
-          <w:lang w:eastAsia="es-CO"/>
-        </w:rPr>
-        <w:t>endpoints</w:t>
-      </w:r>
-      <w:proofErr w:type="spellEnd"/>
-      <w:r>
-        <w:rPr>
-          <w:rFonts w:eastAsia="Calibri" w:cs="Times New Roman"/>
-          <w:color w:val="000000"/>
-          <w:szCs w:val="22"/>
-          <w:lang w:eastAsia="es-CO"/>
-        </w:rPr>
-        <w:t xml:space="preserve"> de la API.</w:t>
-      </w:r>
-    </w:p>
-    <w:p>
-      <w:pPr>
-        <w:pStyle w:val="Prrafodelista"/>
-        <w:numPr>
-          <w:ilvl w:val="0"/>
-          <w:numId w:val="13"/>
-        </w:numPr>
-        <w:rPr>
-          <w:rFonts w:eastAsia="Calibri" w:cs="Times New Roman"/>
-          <w:color w:val="000000"/>
-          <w:szCs w:val="22"/>
-          <w:lang w:eastAsia="es-CO"/>
-        </w:rPr>
-      </w:pPr>
-      <w:r>
-        <w:rPr>
-          <w:rFonts w:eastAsia="Calibri" w:cs="Times New Roman"/>
-          <w:b/>
-          <w:bCs/>
-          <w:color w:val="000000"/>
-          <w:szCs w:val="22"/>
-          <w:lang w:eastAsia="es-CO"/>
-        </w:rPr>
         <w:t>Visual Studio Code / IntelliJ IDEA:</w:t>
       </w:r>
       <w:r>
@@ -3576,23 +3191,7 @@
           <w:b/>
           <w:bCs/>
         </w:rPr>
-        <w:t xml:space="preserve">Lógica de Negocio y </w:t>
-      </w:r>
-      <w:proofErr w:type="spellStart"/>
-      <w:r>
-        <w:rPr>
-          <w:b/>
-          <w:bCs/>
-        </w:rPr>
-        <w:t>Backend</w:t>
-      </w:r>
-      <w:proofErr w:type="spellEnd"/>
-      <w:r>
-        <w:rPr>
-          <w:b/>
-          <w:bCs/>
-        </w:rPr>
-        <w:t xml:space="preserve"> (Spring Boot):</w:t>
+        <w:t>Lógica de Negocio y Backend (Spring Boot):</w:t>
       </w:r>
     </w:p>
     <w:p>
@@ -3627,13 +3226,8 @@
         <w:t>Disposición de un</w:t>
       </w:r>
       <w:r>
-        <w:t xml:space="preserve"> </w:t>
-      </w:r>
-      <w:proofErr w:type="spellStart"/>
-      <w:r>
-        <w:t>endpoint</w:t>
-      </w:r>
-      <w:proofErr w:type="spellEnd"/>
+        <w:t xml:space="preserve"> endpoint</w:t>
+      </w:r>
       <w:r>
         <w:t xml:space="preserve"> de consulta maestro unificado, el cual está diseñado específicamente para ser consumido por el resto de los módulos del recetario.</w:t>
       </w:r>
@@ -3652,39 +3246,7 @@
           <w:bCs/>
         </w:rPr>
         <w:lastRenderedPageBreak/>
-        <w:t xml:space="preserve">Interfaz de Usuario y </w:t>
-      </w:r>
-      <w:proofErr w:type="spellStart"/>
-      <w:r>
-        <w:rPr>
-          <w:b/>
-          <w:bCs/>
-        </w:rPr>
-        <w:t>Frontend</w:t>
-      </w:r>
-      <w:proofErr w:type="spellEnd"/>
-      <w:r>
-        <w:rPr>
-          <w:b/>
-          <w:bCs/>
-        </w:rPr>
-        <w:t xml:space="preserve"> (</w:t>
-      </w:r>
-      <w:proofErr w:type="spellStart"/>
-      <w:r>
-        <w:rPr>
-          <w:b/>
-          <w:bCs/>
-        </w:rPr>
-        <w:t>React</w:t>
-      </w:r>
-      <w:proofErr w:type="spellEnd"/>
-      <w:r>
-        <w:rPr>
-          <w:b/>
-          <w:bCs/>
-        </w:rPr>
-        <w:t>):</w:t>
+        <w:t>Interfaz de Usuario y Frontend (React):</w:t>
       </w:r>
     </w:p>
     <w:p>
@@ -3732,13 +3294,8 @@
         <w:t xml:space="preserve">Implementación de validaciones a través del token JWT para proteger </w:t>
       </w:r>
       <w:r>
-        <w:t xml:space="preserve">los </w:t>
-      </w:r>
-      <w:proofErr w:type="spellStart"/>
-      <w:r>
-        <w:t>endpoints</w:t>
-      </w:r>
-      <w:proofErr w:type="spellEnd"/>
+        <w:t>los endpoints</w:t>
+      </w:r>
       <w:r>
         <w:t xml:space="preserve"> del catálogo (como la creación o edición de productos), respetando el contrato JSON y el sistema de diseño visual (Kit de marca) estipulado para el proyecto.</w:t>
       </w:r>
@@ -3766,15 +3323,7 @@
         <w:pStyle w:val="Estilonotastabla"/>
       </w:pPr>
       <w:r>
-        <w:t xml:space="preserve">Con el objetivo de mantener </w:t>
-      </w:r>
-      <w:proofErr w:type="gramStart"/>
-      <w:r>
-        <w:t>la modularidad</w:t>
-      </w:r>
-      <w:proofErr w:type="gramEnd"/>
-      <w:r>
-        <w:t xml:space="preserve"> y respetar la división de trabajo entre las células del proyecto, se delimita que las siguientes características no forman parte de los entregables de este módulo:</w:t>
+        <w:t>Con el objetivo de mantener la modularidad y respetar la división de trabajo entre las células del proyecto, se delimita que las siguientes características no forman parte de los entregables de este módulo:</w:t>
       </w:r>
     </w:p>
     <w:p>

</xml_diff>

<commit_message>
feat: se agrega en el stack tecnológico el local storage, JASON y diagrama UML, tambien mencionados en objetivos y planteamiento del problema
</commit_message>
<xml_diff>
--- a/célula-1/documentos/informe de requisitos.docx
+++ b/célula-1/documentos/informe de requisitos.docx
@@ -243,7 +243,7 @@
             </w:rPr>
             <w:fldChar w:fldCharType="separate"/>
           </w:r>
-          <w:hyperlink w:anchor="_Toc241954128" w:history="1">
+          <w:hyperlink w:anchor="_Toc241955375" w:history="1">
             <w:r>
               <w:rPr>
                 <w:rStyle w:val="Hipervnculo"/>
@@ -271,7 +271,7 @@
                 <w:noProof/>
                 <w:webHidden/>
               </w:rPr>
-              <w:instrText xml:space="preserve"> PAGEREF _Toc241954128 \h </w:instrText>
+              <w:instrText xml:space="preserve"> PAGEREF _Toc241955375 \h </w:instrText>
             </w:r>
             <w:r>
               <w:rPr>
@@ -315,7 +315,7 @@
               <w:lang w:eastAsia="es-CO"/>
             </w:rPr>
           </w:pPr>
-          <w:hyperlink w:anchor="_Toc241954129" w:history="1">
+          <w:hyperlink w:anchor="_Toc241955376" w:history="1">
             <w:r>
               <w:rPr>
                 <w:rStyle w:val="Hipervnculo"/>
@@ -343,7 +343,7 @@
                 <w:noProof/>
                 <w:webHidden/>
               </w:rPr>
-              <w:instrText xml:space="preserve"> PAGEREF _Toc241954129 \h </w:instrText>
+              <w:instrText xml:space="preserve"> PAGEREF _Toc241955376 \h </w:instrText>
             </w:r>
             <w:r>
               <w:rPr>
@@ -387,7 +387,7 @@
               <w:lang w:eastAsia="es-CO"/>
             </w:rPr>
           </w:pPr>
-          <w:hyperlink w:anchor="_Toc241954130" w:history="1">
+          <w:hyperlink w:anchor="_Toc241955377" w:history="1">
             <w:r>
               <w:rPr>
                 <w:rStyle w:val="Hipervnculo"/>
@@ -415,7 +415,7 @@
                 <w:noProof/>
                 <w:webHidden/>
               </w:rPr>
-              <w:instrText xml:space="preserve"> PAGEREF _Toc241954130 \h </w:instrText>
+              <w:instrText xml:space="preserve"> PAGEREF _Toc241955377 \h </w:instrText>
             </w:r>
             <w:r>
               <w:rPr>
@@ -459,7 +459,7 @@
               <w:lang w:eastAsia="es-CO"/>
             </w:rPr>
           </w:pPr>
-          <w:hyperlink w:anchor="_Toc241954131" w:history="1">
+          <w:hyperlink w:anchor="_Toc241955378" w:history="1">
             <w:r>
               <w:rPr>
                 <w:rStyle w:val="Hipervnculo"/>
@@ -486,7 +486,7 @@
                 <w:noProof/>
                 <w:webHidden/>
               </w:rPr>
-              <w:instrText xml:space="preserve"> PAGEREF _Toc241954131 \h </w:instrText>
+              <w:instrText xml:space="preserve"> PAGEREF _Toc241955378 \h </w:instrText>
             </w:r>
             <w:r>
               <w:rPr>
@@ -530,7 +530,7 @@
               <w:lang w:eastAsia="es-CO"/>
             </w:rPr>
           </w:pPr>
-          <w:hyperlink w:anchor="_Toc241954132" w:history="1">
+          <w:hyperlink w:anchor="_Toc241955379" w:history="1">
             <w:r>
               <w:rPr>
                 <w:rStyle w:val="Hipervnculo"/>
@@ -557,7 +557,7 @@
                 <w:noProof/>
                 <w:webHidden/>
               </w:rPr>
-              <w:instrText xml:space="preserve"> PAGEREF _Toc241954132 \h </w:instrText>
+              <w:instrText xml:space="preserve"> PAGEREF _Toc241955379 \h </w:instrText>
             </w:r>
             <w:r>
               <w:rPr>
@@ -601,7 +601,7 @@
               <w:lang w:eastAsia="es-CO"/>
             </w:rPr>
           </w:pPr>
-          <w:hyperlink w:anchor="_Toc241954133" w:history="1">
+          <w:hyperlink w:anchor="_Toc241955380" w:history="1">
             <w:r>
               <w:rPr>
                 <w:rStyle w:val="Hipervnculo"/>
@@ -630,7 +630,7 @@
                 <w:noProof/>
                 <w:webHidden/>
               </w:rPr>
-              <w:instrText xml:space="preserve"> PAGEREF _Toc241954133 \h </w:instrText>
+              <w:instrText xml:space="preserve"> PAGEREF _Toc241955380 \h </w:instrText>
             </w:r>
             <w:r>
               <w:rPr>
@@ -674,7 +674,7 @@
               <w:lang w:eastAsia="es-CO"/>
             </w:rPr>
           </w:pPr>
-          <w:hyperlink w:anchor="_Toc241954134" w:history="1">
+          <w:hyperlink w:anchor="_Toc241955381" w:history="1">
             <w:r>
               <w:rPr>
                 <w:rStyle w:val="Hipervnculo"/>
@@ -701,7 +701,7 @@
                 <w:noProof/>
                 <w:webHidden/>
               </w:rPr>
-              <w:instrText xml:space="preserve"> PAGEREF _Toc241954134 \h </w:instrText>
+              <w:instrText xml:space="preserve"> PAGEREF _Toc241955381 \h </w:instrText>
             </w:r>
             <w:r>
               <w:rPr>
@@ -745,7 +745,7 @@
               <w:lang w:eastAsia="es-CO"/>
             </w:rPr>
           </w:pPr>
-          <w:hyperlink w:anchor="_Toc241954135" w:history="1">
+          <w:hyperlink w:anchor="_Toc241955382" w:history="1">
             <w:r>
               <w:rPr>
                 <w:rStyle w:val="Hipervnculo"/>
@@ -775,7 +775,7 @@
                 <w:noProof/>
                 <w:webHidden/>
               </w:rPr>
-              <w:instrText xml:space="preserve"> PAGEREF _Toc241954135 \h </w:instrText>
+              <w:instrText xml:space="preserve"> PAGEREF _Toc241955382 \h </w:instrText>
             </w:r>
             <w:r>
               <w:rPr>
@@ -819,7 +819,7 @@
               <w:lang w:eastAsia="es-CO"/>
             </w:rPr>
           </w:pPr>
-          <w:hyperlink w:anchor="_Toc241954136" w:history="1">
+          <w:hyperlink w:anchor="_Toc241955383" w:history="1">
             <w:r>
               <w:rPr>
                 <w:rStyle w:val="Hipervnculo"/>
@@ -848,7 +848,7 @@
                 <w:noProof/>
                 <w:webHidden/>
               </w:rPr>
-              <w:instrText xml:space="preserve"> PAGEREF _Toc241954136 \h </w:instrText>
+              <w:instrText xml:space="preserve"> PAGEREF _Toc241955383 \h </w:instrText>
             </w:r>
             <w:r>
               <w:rPr>
@@ -892,7 +892,7 @@
               <w:lang w:eastAsia="es-CO"/>
             </w:rPr>
           </w:pPr>
-          <w:hyperlink w:anchor="_Toc241954137" w:history="1">
+          <w:hyperlink w:anchor="_Toc241955384" w:history="1">
             <w:r>
               <w:rPr>
                 <w:rStyle w:val="Hipervnculo"/>
@@ -921,7 +921,7 @@
                 <w:noProof/>
                 <w:webHidden/>
               </w:rPr>
-              <w:instrText xml:space="preserve"> PAGEREF _Toc241954137 \h </w:instrText>
+              <w:instrText xml:space="preserve"> PAGEREF _Toc241955384 \h </w:instrText>
             </w:r>
             <w:r>
               <w:rPr>
@@ -965,7 +965,7 @@
               <w:lang w:eastAsia="es-CO"/>
             </w:rPr>
           </w:pPr>
-          <w:hyperlink w:anchor="_Toc241954138" w:history="1">
+          <w:hyperlink w:anchor="_Toc241955385" w:history="1">
             <w:r>
               <w:rPr>
                 <w:rStyle w:val="Hipervnculo"/>
@@ -994,7 +994,7 @@
                 <w:noProof/>
                 <w:webHidden/>
               </w:rPr>
-              <w:instrText xml:space="preserve"> PAGEREF _Toc241954138 \h </w:instrText>
+              <w:instrText xml:space="preserve"> PAGEREF _Toc241955385 \h </w:instrText>
             </w:r>
             <w:r>
               <w:rPr>
@@ -1038,7 +1038,7 @@
               <w:lang w:eastAsia="es-CO"/>
             </w:rPr>
           </w:pPr>
-          <w:hyperlink w:anchor="_Toc241954139" w:history="1">
+          <w:hyperlink w:anchor="_Toc241955386" w:history="1">
             <w:r>
               <w:rPr>
                 <w:rStyle w:val="Hipervnculo"/>
@@ -1067,7 +1067,7 @@
                 <w:noProof/>
                 <w:webHidden/>
               </w:rPr>
-              <w:instrText xml:space="preserve"> PAGEREF _Toc241954139 \h </w:instrText>
+              <w:instrText xml:space="preserve"> PAGEREF _Toc241955386 \h </w:instrText>
             </w:r>
             <w:r>
               <w:rPr>
@@ -1111,7 +1111,7 @@
               <w:lang w:eastAsia="es-CO"/>
             </w:rPr>
           </w:pPr>
-          <w:hyperlink w:anchor="_Toc241954140" w:history="1">
+          <w:hyperlink w:anchor="_Toc241955387" w:history="1">
             <w:r>
               <w:rPr>
                 <w:rStyle w:val="Hipervnculo"/>
@@ -1139,7 +1139,7 @@
                 <w:noProof/>
                 <w:webHidden/>
               </w:rPr>
-              <w:instrText xml:space="preserve"> PAGEREF _Toc241954140 \h </w:instrText>
+              <w:instrText xml:space="preserve"> PAGEREF _Toc241955387 \h </w:instrText>
             </w:r>
             <w:r>
               <w:rPr>
@@ -1183,7 +1183,7 @@
               <w:lang w:eastAsia="es-CO"/>
             </w:rPr>
           </w:pPr>
-          <w:hyperlink w:anchor="_Toc241954141" w:history="1">
+          <w:hyperlink w:anchor="_Toc241955388" w:history="1">
             <w:r>
               <w:rPr>
                 <w:rStyle w:val="Hipervnculo"/>
@@ -1210,7 +1210,7 @@
                 <w:noProof/>
                 <w:webHidden/>
               </w:rPr>
-              <w:instrText xml:space="preserve"> PAGEREF _Toc241954141 \h </w:instrText>
+              <w:instrText xml:space="preserve"> PAGEREF _Toc241955388 \h </w:instrText>
             </w:r>
             <w:r>
               <w:rPr>
@@ -1254,7 +1254,7 @@
               <w:lang w:eastAsia="es-CO"/>
             </w:rPr>
           </w:pPr>
-          <w:hyperlink w:anchor="_Toc241954142" w:history="1">
+          <w:hyperlink w:anchor="_Toc241955389" w:history="1">
             <w:r>
               <w:rPr>
                 <w:rStyle w:val="Hipervnculo"/>
@@ -1282,7 +1282,7 @@
                 <w:noProof/>
                 <w:webHidden/>
               </w:rPr>
-              <w:instrText xml:space="preserve"> PAGEREF _Toc241954142 \h </w:instrText>
+              <w:instrText xml:space="preserve"> PAGEREF _Toc241955389 \h </w:instrText>
             </w:r>
             <w:r>
               <w:rPr>
@@ -1326,7 +1326,7 @@
               <w:lang w:eastAsia="es-CO"/>
             </w:rPr>
           </w:pPr>
-          <w:hyperlink w:anchor="_Toc241954143" w:history="1">
+          <w:hyperlink w:anchor="_Toc241955390" w:history="1">
             <w:r>
               <w:rPr>
                 <w:rStyle w:val="Hipervnculo"/>
@@ -1354,7 +1354,7 @@
                 <w:noProof/>
                 <w:webHidden/>
               </w:rPr>
-              <w:instrText xml:space="preserve"> PAGEREF _Toc241954143 \h </w:instrText>
+              <w:instrText xml:space="preserve"> PAGEREF _Toc241955390 \h </w:instrText>
             </w:r>
             <w:r>
               <w:rPr>
@@ -1398,7 +1398,7 @@
               <w:lang w:eastAsia="es-CO"/>
             </w:rPr>
           </w:pPr>
-          <w:hyperlink w:anchor="_Toc241954144" w:history="1">
+          <w:hyperlink w:anchor="_Toc241955391" w:history="1">
             <w:r>
               <w:rPr>
                 <w:rStyle w:val="Hipervnculo"/>
@@ -1426,7 +1426,7 @@
                 <w:noProof/>
                 <w:webHidden/>
               </w:rPr>
-              <w:instrText xml:space="preserve"> PAGEREF _Toc241954144 \h </w:instrText>
+              <w:instrText xml:space="preserve"> PAGEREF _Toc241955391 \h </w:instrText>
             </w:r>
             <w:r>
               <w:rPr>
@@ -1470,7 +1470,7 @@
               <w:lang w:eastAsia="es-CO"/>
             </w:rPr>
           </w:pPr>
-          <w:hyperlink w:anchor="_Toc241954145" w:history="1">
+          <w:hyperlink w:anchor="_Toc241955392" w:history="1">
             <w:r>
               <w:rPr>
                 <w:rStyle w:val="Hipervnculo"/>
@@ -1498,7 +1498,7 @@
                 <w:noProof/>
                 <w:webHidden/>
               </w:rPr>
-              <w:instrText xml:space="preserve"> PAGEREF _Toc241954145 \h </w:instrText>
+              <w:instrText xml:space="preserve"> PAGEREF _Toc241955392 \h </w:instrText>
             </w:r>
             <w:r>
               <w:rPr>
@@ -1579,7 +1579,7 @@
           <w:szCs w:val="24"/>
         </w:rPr>
       </w:pPr>
-      <w:bookmarkStart w:id="1" w:name="_Toc241954128"/>
+      <w:bookmarkStart w:id="1" w:name="_Toc241955375"/>
       <w:r>
         <w:rPr>
           <w:rFonts w:cs="Times New Roman"/>
@@ -1746,7 +1746,7 @@
           <w:szCs w:val="24"/>
         </w:rPr>
       </w:pPr>
-      <w:bookmarkStart w:id="2" w:name="_Toc241954129"/>
+      <w:bookmarkStart w:id="2" w:name="_Toc241955376"/>
       <w:r>
         <w:rPr>
           <w:rFonts w:cs="Times New Roman"/>
@@ -1828,7 +1828,7 @@
           <w:lang w:val="es-ES"/>
         </w:rPr>
       </w:pPr>
-      <w:bookmarkStart w:id="3" w:name="_Toc241954130"/>
+      <w:bookmarkStart w:id="3" w:name="_Toc241955377"/>
       <w:r>
         <w:rPr>
           <w:lang w:val="es-ES"/>
@@ -1861,30 +1861,72 @@
     </w:p>
     <w:p>
       <w:r>
-        <w:t>El presente documento define, estructura y formaliza los requisitos correspondientes al módulo "Catálogo de Productos Nutresa", el cual ha sido asignado a la Célula 1 dentro del marco de desarrollo del proyecto “Sazón”. Este proyecto consiste en una plataforma digital full-stack de alta envergadura diseñada para Grupo Nutresa, cuya propuesta de valor central radica en permitir a los usuarios gestionar su despensa virtual y recibir recomendaciones de recetas reales basadas en los ingredientes que ya poseen en casa. En este ecosistema tecnológico, el trabajo coordinado entre siete células de desarrollo resulta indispensable para consolidar una experiencia de usuario integral que abarque desde la planificación de menús hasta el cálculo del aporte nutricional.</w:t>
-      </w:r>
-    </w:p>
-    <w:p>
-      <w:r>
-        <w:t>Dentro de esta arquitectura distribuida, el módulo delegado a la Célula 1 actúa como la base estructural e indispensable de toda la aplicación: es el maestro de productos, marcas y presentaciones. Su correcta implementación es crítica, ya que provee la información base sobre la cual los demás módulos (como el recetario, la despensa virtual y el planificador) construirán sus lógicas de negocio. Este catálogo centralizado gestionará el portafolio de marcas emblemáticas del grupo, incluyendo Zenú, Noel, Doria, Colcafé, Chocolisto, Jet y Ranchera, garantizando que la información de cada insumo sea precisa, escalable y fácilmente consumible por el resto del sistema a través de una API REST unificada.</w:t>
+        <w:t>El presente documento define, estructura y formaliza los requisitos correspondientes al módulo "Catálogo de Productos Nutresa", el cual ha sido asignado a la Célula 1 dentro del marco de desarrollo del proyecto “Sazón”. Este proyecto consiste en una plataforma digital full-</w:t>
+      </w:r>
+      <w:proofErr w:type="spellStart"/>
+      <w:r>
+        <w:t>stack</w:t>
+      </w:r>
+      <w:proofErr w:type="spellEnd"/>
+      <w:r>
+        <w:t xml:space="preserve"> de alta envergadura diseñada para Grupo Nutresa, cuya propuesta de valor central radica en permitir a los usuarios gestionar su despensa virtual y recibir recomendaciones de recetas reales basadas en los ingredientes que ya poseen en casa. En este ecosistema tecnológico, el trabajo coordinado entre siete células de desarrollo resulta indispensable para consolidar una experiencia de usuario integral que abarque desde la planificación de menús hasta el cálculo del aporte nutricional.</w:t>
+      </w:r>
+    </w:p>
+    <w:p>
+      <w:r>
+        <w:t xml:space="preserve">Dentro de esta arquitectura distribuida, el módulo delegado a la Célula 1 actúa como la base estructural e indispensable de toda la aplicación: es el maestro de productos, marcas y presentaciones. Su correcta implementación es crítica, ya que provee la información base sobre la cual los demás módulos (como el recetario, la despensa virtual y el planificador) construirán sus lógicas de negocio. Este catálogo centralizado gestionará el portafolio de marcas emblemáticas del grupo, incluyendo Zenú, Noel, Doria, </w:t>
+      </w:r>
+      <w:proofErr w:type="spellStart"/>
+      <w:r>
+        <w:t>Colcafé</w:t>
+      </w:r>
+      <w:proofErr w:type="spellEnd"/>
+      <w:r>
+        <w:t xml:space="preserve">, </w:t>
+      </w:r>
+      <w:proofErr w:type="spellStart"/>
+      <w:r>
+        <w:t>Chocolisto</w:t>
+      </w:r>
+      <w:proofErr w:type="spellEnd"/>
+      <w:r>
+        <w:t>, Jet y Ranchera, garantizando que la información de cada insumo sea precisa, escalable y fácilmente consumible por el resto del sistema a través de una API REST unificada.</w:t>
       </w:r>
     </w:p>
     <w:p>
       <w:r>
         <w:t>Desde el punto de vista técnico y metodológico, la construcción de este módulo exige un enfoque de desarrollo de extremo a extremo (</w:t>
       </w:r>
-      <w:r>
-        <w:t>end-to-end).</w:t>
-      </w:r>
-      <w:r>
-        <w:t xml:space="preserve"> Esto implica el diseño de una interfaz de usuario interactiva y responsiva utilizando React, la construcción de una </w:t>
+      <w:proofErr w:type="spellStart"/>
+      <w:r>
+        <w:t>end-to-end</w:t>
+      </w:r>
+      <w:proofErr w:type="spellEnd"/>
+      <w:r>
+        <w:t>).</w:t>
+      </w:r>
+      <w:r>
+        <w:t xml:space="preserve"> Esto implica el diseño de una interfaz de usuario interactiva y responsiva utilizando </w:t>
+      </w:r>
+      <w:proofErr w:type="spellStart"/>
+      <w:r>
+        <w:t>React</w:t>
+      </w:r>
+      <w:proofErr w:type="spellEnd"/>
+      <w:r>
+        <w:t xml:space="preserve">, la construcción de una </w:t>
       </w:r>
       <w:r>
         <w:lastRenderedPageBreak/>
         <w:t>sólida lógica de servidor (</w:t>
       </w:r>
-      <w:r>
-        <w:t>backend)</w:t>
+      <w:proofErr w:type="spellStart"/>
+      <w:r>
+        <w:t>backend</w:t>
+      </w:r>
+      <w:proofErr w:type="spellEnd"/>
+      <w:r>
+        <w:t>)</w:t>
       </w:r>
       <w:r>
         <w:t xml:space="preserve"> implementada en Spring Boot, y el modelado estricto de una base de datos relacional compartida, donde la Célula 1 aportará exactamente cinco tablas de negocio debidamente normalizadas. Asimismo, el desarrollo estará regido por prácticas de control de versiones y se integrará obligatoriamente con el módulo transversal de Usuarios y Autenticación (Módulo 00) mediante tokens JWT, asegurando así la protección de los datos y el cumplimiento de los estándares de seguridad de la arquitectura.</w:t>
@@ -1894,9 +1936,11 @@
       <w:r>
         <w:t xml:space="preserve">El propósito principal de este informe de requisitos es establecer de manera exhaustiva y clara las directrices, alcances, responsabilidades y componentes técnicos que la Célula 1 deberá construir. A través de este documento, se busca alinear la visión del equipo de desarrollo con los objetivos de negocio de Grupo Nutresa, sirviendo como hoja de ruta para el diseño del modelo de datos, la planificación de los </w:t>
       </w:r>
+      <w:proofErr w:type="spellStart"/>
       <w:r>
         <w:t>endpoints</w:t>
       </w:r>
+      <w:proofErr w:type="spellEnd"/>
       <w:r>
         <w:t xml:space="preserve"> y la creación de la experiencia visual, asegurando que el módulo se ensamble a la perfección con el resto de la plataforma </w:t>
       </w:r>
@@ -1926,7 +1970,7 @@
       <w:pPr>
         <w:pStyle w:val="Ttulo1"/>
       </w:pPr>
-      <w:bookmarkStart w:id="4" w:name="_Toc241954131"/>
+      <w:bookmarkStart w:id="4" w:name="_Toc241955378"/>
       <w:r>
         <w:lastRenderedPageBreak/>
         <w:t>Objetivos</w:t>
@@ -1937,7 +1981,6 @@
       <w:pPr>
         <w:pStyle w:val="Ttulo2"/>
       </w:pPr>
-      <w:bookmarkStart w:id="5" w:name="_Toc241954132"/>
     </w:p>
     <w:p>
       <w:pPr>
@@ -1953,6 +1996,7 @@
       <w:pPr>
         <w:pStyle w:val="Ttulo2"/>
       </w:pPr>
+      <w:bookmarkStart w:id="5" w:name="_Toc241955379"/>
       <w:r>
         <w:t>Objetivo</w:t>
       </w:r>
@@ -1985,7 +2029,7 @@
           <w:lang w:eastAsia="es-CO"/>
         </w:rPr>
       </w:pPr>
-      <w:bookmarkStart w:id="6" w:name="_Toc241954133"/>
+      <w:bookmarkStart w:id="6" w:name="_Toc241955380"/>
       <w:r>
         <w:rPr>
           <w:rFonts w:eastAsia="Times New Roman"/>
@@ -2010,7 +2054,21 @@
         <w:rPr>
           <w:lang w:eastAsia="es-CO"/>
         </w:rPr>
-        <w:t>Documentar los requisitos funcionales y no funcionales del módulo, especificando el filtrado, la visualización y las operaciones CRUD gestionadas con React y Local Storage.</w:t>
+        <w:t xml:space="preserve">Documentar los requisitos funcionales y no funcionales del módulo, especificando el filtrado, la visualización y las operaciones CRUD gestionadas con </w:t>
+      </w:r>
+      <w:proofErr w:type="spellStart"/>
+      <w:r>
+        <w:rPr>
+          <w:lang w:eastAsia="es-CO"/>
+        </w:rPr>
+        <w:t>React</w:t>
+      </w:r>
+      <w:proofErr w:type="spellEnd"/>
+      <w:r>
+        <w:rPr>
+          <w:lang w:eastAsia="es-CO"/>
+        </w:rPr>
+        <w:t xml:space="preserve"> y Local Storage.</w:t>
       </w:r>
     </w:p>
     <w:p>
@@ -2068,7 +2126,7 @@
       <w:pPr>
         <w:pStyle w:val="Ttulo1"/>
       </w:pPr>
-      <w:bookmarkStart w:id="7" w:name="_Toc241954134"/>
+      <w:bookmarkStart w:id="7" w:name="_Toc241955381"/>
       <w:r>
         <w:lastRenderedPageBreak/>
         <w:t>Planteamiento del problema</w:t>
@@ -2091,12 +2149,36 @@
         <w:t xml:space="preserve">”. </w:t>
       </w:r>
       <w:r>
-        <w:t>Este componente actúa como base técnica del recetario, consolidando el portafolio del Grupo Nutresa (Zenú, Noel, Doria, Colcafé, Chocolisto, Jet y Ranchera) como la fuente única de verdad para estructurar cada receta.</w:t>
-      </w:r>
-    </w:p>
-    <w:p>
-      <w:r>
-        <w:t xml:space="preserve">La solución tecnológica emplea una arquitectura web con almacenamiento descentralizado. Mediante React, se despliega una vitrina interactiva con filtros y fichas detalladas, gestionando las operaciones del catálogo (CRUD) bajo patrones de diseño desacoplados. La persistencia se centraliza en el Local Storage del navegador, estructurando conceptualmente los datos con un modelo relacional UML de cinco tablas (productos, marcas, clasificaciones, tamaños y fotografías). Al mantener una estructura de datos estandarizada en formato JSON, se garantiza la interoperabilidad técnica, permitiendo que el catálogo funcione de forma independiente como maestro de productos de consulta local para las demás células </w:t>
+        <w:t xml:space="preserve">Este componente actúa como base técnica del recetario, consolidando el portafolio del Grupo Nutresa (Zenú, Noel, Doria, </w:t>
+      </w:r>
+      <w:proofErr w:type="spellStart"/>
+      <w:r>
+        <w:t>Colcafé</w:t>
+      </w:r>
+      <w:proofErr w:type="spellEnd"/>
+      <w:r>
+        <w:t xml:space="preserve">, </w:t>
+      </w:r>
+      <w:proofErr w:type="spellStart"/>
+      <w:r>
+        <w:t>Chocolisto</w:t>
+      </w:r>
+      <w:proofErr w:type="spellEnd"/>
+      <w:r>
+        <w:t>, Jet y Ranchera) como la fuente única de verdad para estructurar cada receta.</w:t>
+      </w:r>
+    </w:p>
+    <w:p>
+      <w:r>
+        <w:t xml:space="preserve">La solución tecnológica emplea una arquitectura web con almacenamiento descentralizado. Mediante </w:t>
+      </w:r>
+      <w:proofErr w:type="spellStart"/>
+      <w:r>
+        <w:t>React</w:t>
+      </w:r>
+      <w:proofErr w:type="spellEnd"/>
+      <w:r>
+        <w:t xml:space="preserve">, se despliega una vitrina interactiva con filtros y fichas detalladas, gestionando las operaciones del catálogo (CRUD) bajo patrones de diseño desacoplados. La persistencia se centraliza en el Local Storage del navegador, estructurando conceptualmente los datos con un modelo relacional UML de cinco tablas (productos, marcas, clasificaciones, tamaños y fotografías). Al mantener una estructura de datos estandarizada en formato JSON, se garantiza la interoperabilidad técnica, permitiendo que el catálogo funcione de forma independiente como maestro de productos de consulta local para las demás células </w:t>
       </w:r>
     </w:p>
     <w:p>
@@ -2384,6 +2466,7 @@
             <w:r>
               <w:t xml:space="preserve">Desarrollo de una vitrina interactiva en el </w:t>
             </w:r>
+            <w:proofErr w:type="spellStart"/>
             <w:r>
               <w:rPr>
                 <w:i/>
@@ -2391,6 +2474,7 @@
               </w:rPr>
               <w:t>frontend</w:t>
             </w:r>
+            <w:proofErr w:type="spellEnd"/>
             <w:r>
               <w:t xml:space="preserve"> con filtros por categoría, presentación o marca, y una ficha detallada por cada producto.</w:t>
             </w:r>
@@ -2503,7 +2587,7 @@
           <w:lang w:eastAsia="es-CO"/>
         </w:rPr>
       </w:pPr>
-      <w:bookmarkStart w:id="9" w:name="_Toc241954135"/>
+      <w:bookmarkStart w:id="9" w:name="_Toc241955382"/>
       <w:r>
         <w:rPr>
           <w:rFonts w:eastAsia="Times New Roman" w:cs="Times New Roman"/>
@@ -2563,7 +2647,27 @@
           <w:szCs w:val="22"/>
           <w:lang w:eastAsia="es-CO"/>
         </w:rPr>
-        <w:t xml:space="preserve">La solución full-stack para el </w:t>
+        <w:t>La solución full-</w:t>
+      </w:r>
+      <w:proofErr w:type="spellStart"/>
+      <w:r>
+        <w:rPr>
+          <w:rFonts w:eastAsia="Calibri" w:cs="Times New Roman"/>
+          <w:color w:val="000000"/>
+          <w:szCs w:val="22"/>
+          <w:lang w:eastAsia="es-CO"/>
+        </w:rPr>
+        <w:t>stack</w:t>
+      </w:r>
+      <w:proofErr w:type="spellEnd"/>
+      <w:r>
+        <w:rPr>
+          <w:rFonts w:eastAsia="Calibri" w:cs="Times New Roman"/>
+          <w:color w:val="000000"/>
+          <w:szCs w:val="22"/>
+          <w:lang w:eastAsia="es-CO"/>
+        </w:rPr>
+        <w:t xml:space="preserve"> para el </w:t>
       </w:r>
       <w:r>
         <w:rPr>
@@ -2594,13 +2698,22 @@
           <w:lang w:eastAsia="es-CO"/>
         </w:rPr>
       </w:pPr>
-      <w:bookmarkStart w:id="10" w:name="_Toc241954136"/>
+      <w:bookmarkStart w:id="10" w:name="_Toc241955383"/>
+      <w:proofErr w:type="spellStart"/>
       <w:r>
         <w:rPr>
           <w:rFonts w:eastAsia="Times New Roman"/>
           <w:lang w:eastAsia="es-CO"/>
         </w:rPr>
-        <w:t>Frontend (Capa de Presentación)</w:t>
+        <w:t>Frontend</w:t>
+      </w:r>
+      <w:proofErr w:type="spellEnd"/>
+      <w:r>
+        <w:rPr>
+          <w:rFonts w:eastAsia="Times New Roman"/>
+          <w:lang w:eastAsia="es-CO"/>
+        </w:rPr>
+        <w:t xml:space="preserve"> (Capa de Presentación)</w:t>
       </w:r>
       <w:bookmarkEnd w:id="10"/>
     </w:p>
@@ -2618,6 +2731,7 @@
           <w:lang w:eastAsia="es-CO"/>
         </w:rPr>
       </w:pPr>
+      <w:proofErr w:type="spellStart"/>
       <w:r>
         <w:rPr>
           <w:rFonts w:eastAsia="Calibri" w:cs="Times New Roman"/>
@@ -2627,16 +2741,68 @@
           <w:szCs w:val="22"/>
           <w:lang w:eastAsia="es-CO"/>
         </w:rPr>
-        <w:t>React:</w:t>
-      </w:r>
+        <w:t>React</w:t>
+      </w:r>
+      <w:proofErr w:type="spellEnd"/>
       <w:r>
         <w:rPr>
           <w:rFonts w:eastAsia="Calibri" w:cs="Times New Roman"/>
+          <w:b/>
+          <w:bCs/>
           <w:color w:val="000000"/>
           <w:szCs w:val="22"/>
           <w:lang w:eastAsia="es-CO"/>
         </w:rPr>
-        <w:t xml:space="preserve"> Librería/Framework para la construcción de una interfaz dinámica Single Page Application (SPA), enfocada en la vitrina comercial y búsqueda de productos.</w:t>
+        <w:t>:</w:t>
+      </w:r>
+      <w:r>
+        <w:rPr>
+          <w:rFonts w:eastAsia="Calibri" w:cs="Times New Roman"/>
+          <w:color w:val="000000"/>
+          <w:szCs w:val="22"/>
+          <w:lang w:eastAsia="es-CO"/>
+        </w:rPr>
+        <w:t xml:space="preserve"> Librería/Framework para la construcción de una interfaz dinámica </w:t>
+      </w:r>
+      <w:proofErr w:type="gramStart"/>
+      <w:r>
+        <w:rPr>
+          <w:rFonts w:eastAsia="Calibri" w:cs="Times New Roman"/>
+          <w:color w:val="000000"/>
+          <w:szCs w:val="22"/>
+          <w:lang w:eastAsia="es-CO"/>
+        </w:rPr>
+        <w:t>Single</w:t>
+      </w:r>
+      <w:proofErr w:type="gramEnd"/>
+      <w:r>
+        <w:rPr>
+          <w:rFonts w:eastAsia="Calibri" w:cs="Times New Roman"/>
+          <w:color w:val="000000"/>
+          <w:szCs w:val="22"/>
+          <w:lang w:eastAsia="es-CO"/>
+        </w:rPr>
+        <w:t xml:space="preserve"> Page </w:t>
+      </w:r>
+      <w:proofErr w:type="spellStart"/>
+      <w:r>
+        <w:rPr>
+          <w:rFonts w:eastAsia="Calibri" w:cs="Times New Roman"/>
+          <w:color w:val="000000"/>
+          <w:szCs w:val="22"/>
+          <w:lang w:eastAsia="es-CO"/>
+        </w:rPr>
+        <w:t>Application</w:t>
+      </w:r>
+      <w:proofErr w:type="spellEnd"/>
+      <w:r>
+        <w:rPr>
+          <w:rFonts w:eastAsia="Calibri" w:cs="Times New Roman"/>
+          <w:color w:val="000000"/>
+          <w:szCs w:val="22"/>
+          <w:lang w:eastAsia="es-CO"/>
+        </w:rPr>
+        <w:t xml:space="preserve"> (SPA), enfocada en la vitrina comercial y búsqueda de productos.</w:t>
       </w:r>
     </w:p>
     <w:p>
@@ -2662,7 +2828,7 @@
           <w:szCs w:val="22"/>
           <w:lang w:eastAsia="es-CO"/>
         </w:rPr>
-        <w:t>JavaScript (ES6+) / HTML5 / CSS3:</w:t>
+        <w:t>Local Storage (Web Storage API):</w:t>
       </w:r>
       <w:r>
         <w:rPr>
@@ -2671,7 +2837,7 @@
           <w:szCs w:val="22"/>
           <w:lang w:eastAsia="es-CO"/>
         </w:rPr>
-        <w:t xml:space="preserve"> Lenguajes estándar para lógica de interfaz, maquetación semántica y estilos adaptables.</w:t>
+        <w:t xml:space="preserve"> Mecanismo de persistencia de datos empleado como alternativa a una base de datos convencional. Permite almacenar, leer, actualizar y eliminar (CRUD) el catálogo completo de productos Nutresa directamente en el navegador del cliente, garantizando una carga rápida y disponibilidad inmediata de la información sin consumo de red.</w:t>
       </w:r>
     </w:p>
     <w:p>
@@ -2697,6 +2863,241 @@
           <w:szCs w:val="22"/>
           <w:lang w:eastAsia="es-CO"/>
         </w:rPr>
+        <w:t>UML (</w:t>
+      </w:r>
+      <w:proofErr w:type="spellStart"/>
+      <w:r>
+        <w:rPr>
+          <w:rFonts w:eastAsia="Calibri" w:cs="Times New Roman"/>
+          <w:b/>
+          <w:bCs/>
+          <w:color w:val="000000"/>
+          <w:szCs w:val="22"/>
+          <w:lang w:eastAsia="es-CO"/>
+        </w:rPr>
+        <w:t>Unified</w:t>
+      </w:r>
+      <w:proofErr w:type="spellEnd"/>
+      <w:r>
+        <w:rPr>
+          <w:rFonts w:eastAsia="Calibri" w:cs="Times New Roman"/>
+          <w:b/>
+          <w:bCs/>
+          <w:color w:val="000000"/>
+          <w:szCs w:val="22"/>
+          <w:lang w:eastAsia="es-CO"/>
+        </w:rPr>
+        <w:t xml:space="preserve"> </w:t>
+      </w:r>
+      <w:proofErr w:type="spellStart"/>
+      <w:r>
+        <w:rPr>
+          <w:rFonts w:eastAsia="Calibri" w:cs="Times New Roman"/>
+          <w:b/>
+          <w:bCs/>
+          <w:color w:val="000000"/>
+          <w:szCs w:val="22"/>
+          <w:lang w:eastAsia="es-CO"/>
+        </w:rPr>
+        <w:t>Modeling</w:t>
+      </w:r>
+      <w:proofErr w:type="spellEnd"/>
+      <w:r>
+        <w:rPr>
+          <w:rFonts w:eastAsia="Calibri" w:cs="Times New Roman"/>
+          <w:b/>
+          <w:bCs/>
+          <w:color w:val="000000"/>
+          <w:szCs w:val="22"/>
+          <w:lang w:eastAsia="es-CO"/>
+        </w:rPr>
+        <w:t xml:space="preserve"> </w:t>
+      </w:r>
+      <w:proofErr w:type="spellStart"/>
+      <w:r>
+        <w:rPr>
+          <w:rFonts w:eastAsia="Calibri" w:cs="Times New Roman"/>
+          <w:b/>
+          <w:bCs/>
+          <w:color w:val="000000"/>
+          <w:szCs w:val="22"/>
+          <w:lang w:eastAsia="es-CO"/>
+        </w:rPr>
+        <w:t>Language</w:t>
+      </w:r>
+      <w:proofErr w:type="spellEnd"/>
+      <w:r>
+        <w:rPr>
+          <w:rFonts w:eastAsia="Calibri" w:cs="Times New Roman"/>
+          <w:b/>
+          <w:bCs/>
+          <w:color w:val="000000"/>
+          <w:szCs w:val="22"/>
+          <w:lang w:eastAsia="es-CO"/>
+        </w:rPr>
+        <w:t>):</w:t>
+      </w:r>
+      <w:r>
+        <w:rPr>
+          <w:rFonts w:eastAsia="Calibri" w:cs="Times New Roman"/>
+          <w:color w:val="000000"/>
+          <w:szCs w:val="22"/>
+          <w:lang w:eastAsia="es-CO"/>
+        </w:rPr>
+        <w:t xml:space="preserve"> Lenguaje de modelado utilizado en la fase de diseño lógico. Se emplea para trazar conceptualmente el diagrama relacional de las cinco tablas (productos, marcas, clasificaciones, tamaños y fotografías), asegurando que la estructura del JSON final mantenga la integridad y normalización requerida por el negocio.</w:t>
+      </w:r>
+    </w:p>
+    <w:p>
+      <w:pPr>
+        <w:pStyle w:val="Prrafodelista"/>
+        <w:numPr>
+          <w:ilvl w:val="0"/>
+          <w:numId w:val="9"/>
+        </w:numPr>
+        <w:rPr>
+          <w:rFonts w:eastAsia="Calibri" w:cs="Times New Roman"/>
+          <w:color w:val="000000"/>
+          <w:szCs w:val="22"/>
+          <w:lang w:eastAsia="es-CO"/>
+        </w:rPr>
+      </w:pPr>
+      <w:r>
+        <w:rPr>
+          <w:rFonts w:eastAsia="Calibri" w:cs="Times New Roman"/>
+          <w:b/>
+          <w:bCs/>
+          <w:color w:val="000000"/>
+          <w:szCs w:val="22"/>
+          <w:lang w:eastAsia="es-CO"/>
+        </w:rPr>
+        <w:t xml:space="preserve">JSON (JavaScript </w:t>
+      </w:r>
+      <w:proofErr w:type="spellStart"/>
+      <w:r>
+        <w:rPr>
+          <w:rFonts w:eastAsia="Calibri" w:cs="Times New Roman"/>
+          <w:b/>
+          <w:bCs/>
+          <w:color w:val="000000"/>
+          <w:szCs w:val="22"/>
+          <w:lang w:eastAsia="es-CO"/>
+        </w:rPr>
+        <w:t>Object</w:t>
+      </w:r>
+      <w:proofErr w:type="spellEnd"/>
+      <w:r>
+        <w:rPr>
+          <w:rFonts w:eastAsia="Calibri" w:cs="Times New Roman"/>
+          <w:b/>
+          <w:bCs/>
+          <w:color w:val="000000"/>
+          <w:szCs w:val="22"/>
+          <w:lang w:eastAsia="es-CO"/>
+        </w:rPr>
+        <w:t xml:space="preserve"> </w:t>
+      </w:r>
+      <w:proofErr w:type="spellStart"/>
+      <w:r>
+        <w:rPr>
+          <w:rFonts w:eastAsia="Calibri" w:cs="Times New Roman"/>
+          <w:b/>
+          <w:bCs/>
+          <w:color w:val="000000"/>
+          <w:szCs w:val="22"/>
+          <w:lang w:eastAsia="es-CO"/>
+        </w:rPr>
+        <w:t>Notation</w:t>
+      </w:r>
+      <w:proofErr w:type="spellEnd"/>
+      <w:r>
+        <w:rPr>
+          <w:rFonts w:eastAsia="Calibri" w:cs="Times New Roman"/>
+          <w:b/>
+          <w:bCs/>
+          <w:color w:val="000000"/>
+          <w:szCs w:val="22"/>
+          <w:lang w:eastAsia="es-CO"/>
+        </w:rPr>
+        <w:t>):</w:t>
+      </w:r>
+      <w:r>
+        <w:rPr>
+          <w:rFonts w:eastAsia="Calibri" w:cs="Times New Roman"/>
+          <w:color w:val="000000"/>
+          <w:szCs w:val="22"/>
+          <w:lang w:eastAsia="es-CO"/>
+        </w:rPr>
+        <w:t xml:space="preserve"> Formato estándar de texto utilizado para estructurar y serializar los datos dentro del Local Storage. Actúa como el puente de </w:t>
+      </w:r>
+      <w:r>
+        <w:rPr>
+          <w:rFonts w:eastAsia="Calibri" w:cs="Times New Roman"/>
+          <w:color w:val="000000"/>
+          <w:szCs w:val="22"/>
+          <w:lang w:eastAsia="es-CO"/>
+        </w:rPr>
+        <w:lastRenderedPageBreak/>
+        <w:t>interoperabilidad (contrato de datos), permitiendo que las demás células del recetario consulten y consuman el maestro de productos de manera estandarizada.</w:t>
+      </w:r>
+    </w:p>
+    <w:p>
+      <w:pPr>
+        <w:pStyle w:val="Prrafodelista"/>
+        <w:numPr>
+          <w:ilvl w:val="0"/>
+          <w:numId w:val="9"/>
+        </w:numPr>
+        <w:rPr>
+          <w:rFonts w:eastAsia="Calibri" w:cs="Times New Roman"/>
+          <w:color w:val="000000"/>
+          <w:szCs w:val="22"/>
+          <w:lang w:eastAsia="es-CO"/>
+        </w:rPr>
+      </w:pPr>
+      <w:r>
+        <w:rPr>
+          <w:rFonts w:eastAsia="Calibri" w:cs="Times New Roman"/>
+          <w:b/>
+          <w:bCs/>
+          <w:color w:val="000000"/>
+          <w:szCs w:val="22"/>
+          <w:lang w:eastAsia="es-CO"/>
+        </w:rPr>
+        <w:t>JavaScript (ES6+) / HTML5 / CSS3:</w:t>
+      </w:r>
+      <w:r>
+        <w:rPr>
+          <w:rFonts w:eastAsia="Calibri" w:cs="Times New Roman"/>
+          <w:color w:val="000000"/>
+          <w:szCs w:val="22"/>
+          <w:lang w:eastAsia="es-CO"/>
+        </w:rPr>
+        <w:t xml:space="preserve"> Lenguajes estándar para lógica de interfaz, maquetación semántica y estilos adaptables.</w:t>
+      </w:r>
+    </w:p>
+    <w:p>
+      <w:pPr>
+        <w:pStyle w:val="Prrafodelista"/>
+        <w:numPr>
+          <w:ilvl w:val="0"/>
+          <w:numId w:val="9"/>
+        </w:numPr>
+        <w:rPr>
+          <w:rFonts w:eastAsia="Calibri" w:cs="Times New Roman"/>
+          <w:color w:val="000000"/>
+          <w:szCs w:val="22"/>
+          <w:lang w:eastAsia="es-CO"/>
+        </w:rPr>
+      </w:pPr>
+      <w:r>
+        <w:rPr>
+          <w:rFonts w:eastAsia="Calibri" w:cs="Times New Roman"/>
+          <w:b/>
+          <w:bCs/>
+          <w:color w:val="000000"/>
+          <w:szCs w:val="22"/>
+          <w:lang w:eastAsia="es-CO"/>
+        </w:rPr>
         <w:t>Axios / Fetch API:</w:t>
       </w:r>
       <w:r>
@@ -2706,7 +3107,27 @@
           <w:szCs w:val="22"/>
           <w:lang w:eastAsia="es-CO"/>
         </w:rPr>
-        <w:t xml:space="preserve"> Consumo de la API REST backend mediante peticiones HTTP asíncronas.</w:t>
+        <w:t xml:space="preserve"> Consumo de la API REST </w:t>
+      </w:r>
+      <w:proofErr w:type="spellStart"/>
+      <w:r>
+        <w:rPr>
+          <w:rFonts w:eastAsia="Calibri" w:cs="Times New Roman"/>
+          <w:color w:val="000000"/>
+          <w:szCs w:val="22"/>
+          <w:lang w:eastAsia="es-CO"/>
+        </w:rPr>
+        <w:t>backend</w:t>
+      </w:r>
+      <w:proofErr w:type="spellEnd"/>
+      <w:r>
+        <w:rPr>
+          <w:rFonts w:eastAsia="Calibri" w:cs="Times New Roman"/>
+          <w:color w:val="000000"/>
+          <w:szCs w:val="22"/>
+          <w:lang w:eastAsia="es-CO"/>
+        </w:rPr>
+        <w:t xml:space="preserve"> mediante peticiones HTTP asíncronas.</w:t>
       </w:r>
     </w:p>
     <w:p>
@@ -2717,13 +3138,22 @@
           <w:lang w:eastAsia="es-CO"/>
         </w:rPr>
       </w:pPr>
-      <w:bookmarkStart w:id="11" w:name="_Toc241954137"/>
+      <w:bookmarkStart w:id="11" w:name="_Toc241955384"/>
+      <w:proofErr w:type="spellStart"/>
       <w:r>
         <w:rPr>
           <w:rFonts w:eastAsia="Times New Roman"/>
           <w:lang w:eastAsia="es-CO"/>
         </w:rPr>
-        <w:t>Backend (Capa de Lógica de Negocio)</w:t>
+        <w:t>Backend</w:t>
+      </w:r>
+      <w:proofErr w:type="spellEnd"/>
+      <w:r>
+        <w:rPr>
+          <w:rFonts w:eastAsia="Times New Roman"/>
+          <w:lang w:eastAsia="es-CO"/>
+        </w:rPr>
+        <w:t xml:space="preserve"> (Capa de Lógica de Negocio)</w:t>
       </w:r>
       <w:bookmarkEnd w:id="11"/>
     </w:p>
@@ -2829,47 +3259,48 @@
           <w:szCs w:val="22"/>
           <w:lang w:eastAsia="es-CO"/>
         </w:rPr>
-        <w:t xml:space="preserve"> Decodificación y validación de tokens Bearer para proteger endpoints administrativos (como la creación y modificación de productos).</w:t>
-      </w:r>
-    </w:p>
-    <w:p>
-      <w:pPr>
+        <w:t xml:space="preserve"> Decodificación y validación de tokens Bearer para proteger </w:t>
+      </w:r>
+      <w:proofErr w:type="spellStart"/>
+      <w:r>
         <w:rPr>
           <w:rFonts w:eastAsia="Calibri" w:cs="Times New Roman"/>
           <w:color w:val="000000"/>
           <w:szCs w:val="22"/>
           <w:lang w:eastAsia="es-CO"/>
         </w:rPr>
-      </w:pPr>
-    </w:p>
-    <w:p>
-      <w:pPr>
+        <w:t>endpoints</w:t>
+      </w:r>
+      <w:proofErr w:type="spellEnd"/>
+      <w:r>
         <w:rPr>
           <w:rFonts w:eastAsia="Calibri" w:cs="Times New Roman"/>
           <w:color w:val="000000"/>
           <w:szCs w:val="22"/>
           <w:lang w:eastAsia="es-CO"/>
         </w:rPr>
+        <w:t xml:space="preserve"> administrativos (como la creación y modificación de productos).</w:t>
+      </w:r>
+    </w:p>
+    <w:p>
+      <w:pPr>
+        <w:rPr>
+          <w:rFonts w:eastAsia="Calibri" w:cs="Times New Roman"/>
+          <w:color w:val="000000"/>
+          <w:szCs w:val="22"/>
+          <w:lang w:eastAsia="es-CO"/>
+        </w:rPr>
       </w:pPr>
     </w:p>
     <w:p>
       <w:pPr>
         <w:pStyle w:val="Ttulo2"/>
         <w:rPr>
-          <w:rFonts w:eastAsia="Calibri"/>
-          <w:lang w:eastAsia="es-CO"/>
-        </w:rPr>
-      </w:pPr>
-    </w:p>
-    <w:p>
-      <w:pPr>
-        <w:pStyle w:val="Ttulo2"/>
-        <w:rPr>
           <w:rFonts w:eastAsia="Times New Roman"/>
           <w:lang w:eastAsia="es-CO"/>
         </w:rPr>
       </w:pPr>
-      <w:bookmarkStart w:id="12" w:name="_Toc241954138"/>
+      <w:bookmarkStart w:id="12" w:name="_Toc241955385"/>
       <w:r>
         <w:rPr>
           <w:rFonts w:eastAsia="Times New Roman"/>
@@ -2924,7 +3355,27 @@
           <w:szCs w:val="22"/>
           <w:lang w:eastAsia="es-CO"/>
         </w:rPr>
-        <w:t>Spring Data JPA / Hibernate: Mapeo objeto-relacional (ORM) para ejecutar operaciones CRUD y gestionar las 5 tablas asignadas a la Célula 1.</w:t>
+        <w:t xml:space="preserve">Spring Data JPA / </w:t>
+      </w:r>
+      <w:proofErr w:type="spellStart"/>
+      <w:r>
+        <w:rPr>
+          <w:rFonts w:eastAsia="Calibri" w:cs="Times New Roman"/>
+          <w:color w:val="000000"/>
+          <w:szCs w:val="22"/>
+          <w:lang w:eastAsia="es-CO"/>
+        </w:rPr>
+        <w:t>Hibernate</w:t>
+      </w:r>
+      <w:proofErr w:type="spellEnd"/>
+      <w:r>
+        <w:rPr>
+          <w:rFonts w:eastAsia="Calibri" w:cs="Times New Roman"/>
+          <w:color w:val="000000"/>
+          <w:szCs w:val="22"/>
+          <w:lang w:eastAsia="es-CO"/>
+        </w:rPr>
+        <w:t>: Mapeo objeto-relacional (ORM) para ejecutar operaciones CRUD y gestionar las 5 tablas asignadas a la Célula 1.</w:t>
       </w:r>
     </w:p>
     <w:p>
@@ -2935,7 +3386,7 @@
           <w:lang w:eastAsia="es-CO"/>
         </w:rPr>
       </w:pPr>
-      <w:bookmarkStart w:id="13" w:name="_Toc241954139"/>
+      <w:bookmarkStart w:id="13" w:name="_Toc241955386"/>
       <w:r>
         <w:rPr>
           <w:rFonts w:eastAsia="Times New Roman"/>
@@ -2977,12 +3428,21 @@
         </w:rPr>
         <w:t xml:space="preserve"> Control de versiones distribuido bajo flujo de trabajo por ramas por célula (</w:t>
       </w:r>
+      <w:proofErr w:type="spellStart"/>
       <w:r>
         <w:rPr>
           <w:rStyle w:val="EstilonotastablaCar"/>
           <w:lang w:eastAsia="es-CO"/>
         </w:rPr>
-        <w:t>GitFlow).</w:t>
+        <w:t>GitFlow</w:t>
+      </w:r>
+      <w:proofErr w:type="spellEnd"/>
+      <w:r>
+        <w:rPr>
+          <w:rStyle w:val="EstilonotastablaCar"/>
+          <w:lang w:eastAsia="es-CO"/>
+        </w:rPr>
+        <w:t>).</w:t>
       </w:r>
     </w:p>
     <w:p>
@@ -3017,7 +3477,27 @@
           <w:szCs w:val="22"/>
           <w:lang w:eastAsia="es-CO"/>
         </w:rPr>
-        <w:t xml:space="preserve"> Pruebas y validación de contratos JSON de los endpoints de la API.</w:t>
+        <w:t xml:space="preserve"> Pruebas y validación de contratos JSON de los </w:t>
+      </w:r>
+      <w:proofErr w:type="spellStart"/>
+      <w:r>
+        <w:rPr>
+          <w:rFonts w:eastAsia="Calibri" w:cs="Times New Roman"/>
+          <w:color w:val="000000"/>
+          <w:szCs w:val="22"/>
+          <w:lang w:eastAsia="es-CO"/>
+        </w:rPr>
+        <w:t>endpoints</w:t>
+      </w:r>
+      <w:proofErr w:type="spellEnd"/>
+      <w:r>
+        <w:rPr>
+          <w:rFonts w:eastAsia="Calibri" w:cs="Times New Roman"/>
+          <w:color w:val="000000"/>
+          <w:szCs w:val="22"/>
+          <w:lang w:eastAsia="es-CO"/>
+        </w:rPr>
+        <w:t xml:space="preserve"> de la API.</w:t>
       </w:r>
     </w:p>
     <w:p>
@@ -3104,7 +3584,7 @@
           <w:szCs w:val="24"/>
         </w:rPr>
       </w:pPr>
-      <w:bookmarkStart w:id="14" w:name="_Toc241954140"/>
+      <w:bookmarkStart w:id="14" w:name="_Toc241955387"/>
       <w:r>
         <w:rPr>
           <w:rFonts w:cs="Times New Roman"/>
@@ -3129,7 +3609,7 @@
           <w:rFonts w:cs="Times New Roman"/>
         </w:rPr>
       </w:pPr>
-      <w:bookmarkStart w:id="15" w:name="_Toc241954141"/>
+      <w:bookmarkStart w:id="15" w:name="_Toc241955388"/>
       <w:r>
         <w:t>Inclusiones</w:t>
       </w:r>
@@ -3191,7 +3671,23 @@
           <w:b/>
           <w:bCs/>
         </w:rPr>
-        <w:t>Lógica de Negocio y Backend (Spring Boot):</w:t>
+        <w:t xml:space="preserve">Lógica de Negocio y </w:t>
+      </w:r>
+      <w:proofErr w:type="spellStart"/>
+      <w:r>
+        <w:rPr>
+          <w:b/>
+          <w:bCs/>
+        </w:rPr>
+        <w:t>Backend</w:t>
+      </w:r>
+      <w:proofErr w:type="spellEnd"/>
+      <w:r>
+        <w:rPr>
+          <w:b/>
+          <w:bCs/>
+        </w:rPr>
+        <w:t xml:space="preserve"> (Spring Boot):</w:t>
       </w:r>
     </w:p>
     <w:p>
@@ -3226,8 +3722,13 @@
         <w:t>Disposición de un</w:t>
       </w:r>
       <w:r>
-        <w:t xml:space="preserve"> endpoint</w:t>
-      </w:r>
+        <w:t xml:space="preserve"> </w:t>
+      </w:r>
+      <w:proofErr w:type="spellStart"/>
+      <w:r>
+        <w:t>endpoint</w:t>
+      </w:r>
+      <w:proofErr w:type="spellEnd"/>
       <w:r>
         <w:t xml:space="preserve"> de consulta maestro unificado, el cual está diseñado específicamente para ser consumido por el resto de los módulos del recetario.</w:t>
       </w:r>
@@ -3246,7 +3747,39 @@
           <w:bCs/>
         </w:rPr>
         <w:lastRenderedPageBreak/>
-        <w:t>Interfaz de Usuario y Frontend (React):</w:t>
+        <w:t xml:space="preserve">Interfaz de Usuario y </w:t>
+      </w:r>
+      <w:proofErr w:type="spellStart"/>
+      <w:r>
+        <w:rPr>
+          <w:b/>
+          <w:bCs/>
+        </w:rPr>
+        <w:t>Frontend</w:t>
+      </w:r>
+      <w:proofErr w:type="spellEnd"/>
+      <w:r>
+        <w:rPr>
+          <w:b/>
+          <w:bCs/>
+        </w:rPr>
+        <w:t xml:space="preserve"> (</w:t>
+      </w:r>
+      <w:proofErr w:type="spellStart"/>
+      <w:r>
+        <w:rPr>
+          <w:b/>
+          <w:bCs/>
+        </w:rPr>
+        <w:t>React</w:t>
+      </w:r>
+      <w:proofErr w:type="spellEnd"/>
+      <w:r>
+        <w:rPr>
+          <w:b/>
+          <w:bCs/>
+        </w:rPr>
+        <w:t>):</w:t>
       </w:r>
     </w:p>
     <w:p>
@@ -3294,8 +3827,13 @@
         <w:t xml:space="preserve">Implementación de validaciones a través del token JWT para proteger </w:t>
       </w:r>
       <w:r>
-        <w:t>los endpoints</w:t>
-      </w:r>
+        <w:t xml:space="preserve">los </w:t>
+      </w:r>
+      <w:proofErr w:type="spellStart"/>
+      <w:r>
+        <w:t>endpoints</w:t>
+      </w:r>
+      <w:proofErr w:type="spellEnd"/>
       <w:r>
         <w:t xml:space="preserve"> del catálogo (como la creación o edición de productos), respetando el contrato JSON y el sistema de diseño visual (Kit de marca) estipulado para el proyecto.</w:t>
       </w:r>
@@ -3309,7 +3847,7 @@
           <w:szCs w:val="22"/>
         </w:rPr>
       </w:pPr>
-      <w:bookmarkStart w:id="16" w:name="_Toc241954142"/>
+      <w:bookmarkStart w:id="16" w:name="_Toc241955389"/>
       <w:r>
         <w:rPr>
           <w:rFonts w:eastAsia="Times New Roman"/>
@@ -3323,7 +3861,15 @@
         <w:pStyle w:val="Estilonotastabla"/>
       </w:pPr>
       <w:r>
-        <w:t>Con el objetivo de mantener la modularidad y respetar la división de trabajo entre las células del proyecto, se delimita que las siguientes características no forman parte de los entregables de este módulo:</w:t>
+        <w:t xml:space="preserve">Con el objetivo de mantener </w:t>
+      </w:r>
+      <w:proofErr w:type="gramStart"/>
+      <w:r>
+        <w:t>la modularidad</w:t>
+      </w:r>
+      <w:proofErr w:type="gramEnd"/>
+      <w:r>
+        <w:t xml:space="preserve"> y respetar la división de trabajo entre las células del proyecto, se delimita que las siguientes características no forman parte de los entregables de este módulo:</w:t>
       </w:r>
     </w:p>
     <w:p>
@@ -3482,7 +4028,7 @@
           <w:rFonts w:cs="Times New Roman"/>
         </w:rPr>
       </w:pPr>
-      <w:bookmarkStart w:id="17" w:name="_Toc241954143"/>
+      <w:bookmarkStart w:id="17" w:name="_Toc241955390"/>
       <w:r>
         <w:rPr>
           <w:rFonts w:cs="Times New Roman"/>
@@ -3540,7 +4086,7 @@
           <w:rFonts w:cs="Times New Roman"/>
         </w:rPr>
       </w:pPr>
-      <w:bookmarkStart w:id="18" w:name="_Toc241954144"/>
+      <w:bookmarkStart w:id="18" w:name="_Toc241955391"/>
       <w:r>
         <w:rPr>
           <w:rFonts w:cs="Times New Roman"/>
@@ -3593,7 +4139,7 @@
           <w:szCs w:val="24"/>
         </w:rPr>
       </w:pPr>
-      <w:bookmarkStart w:id="19" w:name="_Toc241954145"/>
+      <w:bookmarkStart w:id="19" w:name="_Toc241955392"/>
       <w:r>
         <w:rPr>
           <w:rFonts w:cs="Times New Roman"/>
@@ -5138,14 +5684,14 @@
   <w:abstractNum w:abstractNumId="12" w15:restartNumberingAfterBreak="0">
     <w:nsid w:val="70A5404A"/>
     <w:multiLevelType w:val="hybridMultilevel"/>
-    <w:tmpl w:val="9478484A"/>
+    <w:tmpl w:val="0E9E42EC"/>
     <w:lvl w:ilvl="0" w:tplc="240A0001">
       <w:start w:val="1"/>
       <w:numFmt w:val="bullet"/>
       <w:lvlText w:val=""/>
       <w:lvlJc w:val="left"/>
       <w:pPr>
-        <w:ind w:left="1440" w:hanging="360"/>
+        <w:ind w:left="360" w:hanging="360"/>
       </w:pPr>
       <w:rPr>
         <w:rFonts w:ascii="Symbol" w:hAnsi="Symbol" w:hint="default"/>

</xml_diff>

<commit_message>
feat: se agrega conclusiones del trabajo en grupo, se pasa glosario como apéndice antes del las regulaciones
</commit_message>
<xml_diff>
--- a/célula-1/documentos/informe de requisitos.docx
+++ b/célula-1/documentos/informe de requisitos.docx
@@ -2379,7 +2379,7 @@
         </w:rPr>
         <w:fldChar w:fldCharType="separate"/>
       </w:r>
-      <w:hyperlink w:anchor="_Toc241959191" w:history="1">
+      <w:hyperlink w:anchor="_Toc241960399" w:history="1">
         <w:r>
           <w:rPr>
             <w:rStyle w:val="Hipervnculo"/>
@@ -2408,7 +2408,7 @@
             <w:noProof/>
             <w:webHidden/>
           </w:rPr>
-          <w:instrText xml:space="preserve"> PAGEREF _Toc241959191 \h </w:instrText>
+          <w:instrText xml:space="preserve"> PAGEREF _Toc241960399 \h </w:instrText>
         </w:r>
         <w:r>
           <w:rPr>
@@ -2452,7 +2452,7 @@
           <w:lang w:eastAsia="es-CO"/>
         </w:rPr>
       </w:pPr>
-      <w:hyperlink w:anchor="_Toc241959192" w:history="1">
+      <w:hyperlink w:anchor="_Toc241960400" w:history="1">
         <w:r>
           <w:rPr>
             <w:rStyle w:val="Hipervnculo"/>
@@ -2481,7 +2481,7 @@
             <w:noProof/>
             <w:webHidden/>
           </w:rPr>
-          <w:instrText xml:space="preserve"> PAGEREF _Toc241959192 \h </w:instrText>
+          <w:instrText xml:space="preserve"> PAGEREF _Toc241960400 \h </w:instrText>
         </w:r>
         <w:r>
           <w:rPr>
@@ -5233,6 +5233,7 @@
         <w:t xml:space="preserve">El modelo relacional sin redundancias se compone de cinco tablas conectadas mediante integridad referencial: </w:t>
       </w:r>
     </w:p>
+    <w:p/>
     <w:p>
       <w:pPr>
         <w:numPr>
@@ -5502,7 +5503,6 @@
       </w:pPr>
       <w:bookmarkStart w:id="23" w:name="_Toc241959186"/>
       <w:r>
-        <w:lastRenderedPageBreak/>
         <w:t xml:space="preserve">Arquitectura de </w:t>
       </w:r>
       <w:proofErr w:type="gramStart"/>
@@ -5524,7 +5524,7 @@
           <w:noProof/>
         </w:rPr>
         <w:drawing>
-          <wp:inline distT="0" distB="0" distL="0" distR="0" wp14:anchorId="22F51E20" wp14:editId="61E02620">
+          <wp:inline distT="0" distB="0" distL="0" distR="0" wp14:anchorId="22F51E20" wp14:editId="2C2CD47A">
             <wp:extent cx="4238625" cy="5154644"/>
             <wp:effectExtent l="0" t="0" r="0" b="8255"/>
             <wp:docPr id="475206534" name="Imagen 1"/>
@@ -5587,7 +5587,7 @@
           <w:szCs w:val="24"/>
         </w:rPr>
       </w:pPr>
-      <w:bookmarkStart w:id="24" w:name="_Toc241959191"/>
+      <w:bookmarkStart w:id="24" w:name="_Toc241960399"/>
       <w:r>
         <w:rPr>
           <w:b/>
@@ -5692,7 +5692,6 @@
       </w:pPr>
       <w:bookmarkStart w:id="25" w:name="_Toc241959187"/>
       <w:r>
-        <w:lastRenderedPageBreak/>
         <w:t xml:space="preserve">Arquitectura de </w:t>
       </w:r>
       <w:proofErr w:type="gramStart"/>
@@ -5777,7 +5776,7 @@
           <w:szCs w:val="24"/>
         </w:rPr>
       </w:pPr>
-      <w:bookmarkStart w:id="26" w:name="_Toc241959192"/>
+      <w:bookmarkStart w:id="26" w:name="_Toc241960400"/>
       <w:r>
         <w:rPr>
           <w:b/>
@@ -5901,59 +5900,101 @@
           <w:rFonts w:cs="Times New Roman"/>
         </w:rPr>
         <w:lastRenderedPageBreak/>
-        <w:t>Glosario</w:t>
-      </w:r>
+        <w:t>Conclusiones</w:t>
+      </w:r>
+    </w:p>
+    <w:p>
+      <w:r>
+        <w:t>El desarrollo del presente informe de requisitos representó un desafío colaborativo significativo, especialmente en la adopción de la metodología Git Flow para la integración de un documento ofimático. Inicialmente, la curva de aprendizaje resultó compleja; la gestión del control de versiones y de las ramas (</w:t>
+      </w:r>
+      <w:proofErr w:type="spellStart"/>
+      <w:r>
+        <w:rPr>
+          <w:i/>
+          <w:iCs/>
+        </w:rPr>
+        <w:t>branches</w:t>
+      </w:r>
+      <w:proofErr w:type="spellEnd"/>
+      <w:r>
+        <w:t>) en archivos que no son de texto plano conllevó conflictos de integración, la alteración de archivos temporales y el reinicio del proceso mediante la creación y eliminación de múltiples repositorios de práctica. Sin embargo, estas dificultades técnicas impulsaron al equipo de trabajo a reunirse durante varios días para ensayar el flujo de trabajo, lo cual transformó el esfuerzo independiente en una verdadera integración técnica.</w:t>
+      </w:r>
+    </w:p>
+    <w:p>
+      <w:r>
+        <w:t xml:space="preserve">En segundo lugar, una conclusión fundamental de esta fase radicó en la comprensión de la importancia de la cohesión documental dentro del trabajo distribuido. Aunque las tareas se dividieron estratégicamente entre los integrantes del equipo (Santiago, Katherin, Carlos </w:t>
+      </w:r>
+      <w:proofErr w:type="spellStart"/>
+      <w:r>
+        <w:t>Duvan</w:t>
+      </w:r>
+      <w:proofErr w:type="spellEnd"/>
+      <w:r>
+        <w:t xml:space="preserve">, </w:t>
+      </w:r>
+      <w:r>
+        <w:t>Daniel</w:t>
+      </w:r>
+      <w:r>
+        <w:t xml:space="preserve"> y </w:t>
+      </w:r>
+      <w:proofErr w:type="spellStart"/>
+      <w:r>
+        <w:t>Maria</w:t>
+      </w:r>
+      <w:proofErr w:type="spellEnd"/>
+      <w:r>
+        <w:t xml:space="preserve"> Paz), se evidenció que la fragmentación de responsabilidades no exime del conocimiento global del proyecto. Resultó imprescindible que cada miembro leyera y revisara las secciones redactadas por los demás; solo mediante esta revisión cruzada se logró que el documento final adquiriera sentido, fluidez y un tono unificado. Esto demostró que la verdadera integración trasciende la ejecución técnica de un </w:t>
+      </w:r>
+      <w:proofErr w:type="spellStart"/>
+      <w:r>
+        <w:rPr>
+          <w:i/>
+          <w:iCs/>
+        </w:rPr>
+        <w:t>merge</w:t>
+      </w:r>
+      <w:proofErr w:type="spellEnd"/>
+      <w:r>
+        <w:t xml:space="preserve"> en un repositorio.</w:t>
+      </w:r>
+    </w:p>
+    <w:p>
+      <w:r>
+        <w:t xml:space="preserve">Finalmente, el proceso reafirmó el valor del compromiso individual y el apoyo mutuo. La asunción responsable de cada rol asignado permitió que el grupo funcionara como una unidad operativa ante la frustración generada por las herramientas de versionado. Las dificultades presentadas se solucionaron gracias a la comunicación constante y la disposición de ayuda entre los miembros, lo que dejó como mayor aprendizaje la </w:t>
+      </w:r>
+      <w:r>
+        <w:lastRenderedPageBreak/>
+        <w:t>consolidación de una base sólida de trabajo colaborativo. La superación de estos obstáculos técnicos y metodológicos establece un precedente indispensable para las siguientes fases de desarrollo del proyecto Sazón.</w:t>
+      </w:r>
+    </w:p>
+    <w:p/>
+    <w:p>
+      <w:pPr>
+        <w:spacing w:after="160" w:line="278" w:lineRule="auto"/>
+        <w:ind w:firstLine="0"/>
+        <w:rPr>
+          <w:rFonts w:eastAsiaTheme="majorEastAsia" w:cs="Times New Roman"/>
+          <w:b/>
+          <w:szCs w:val="40"/>
+        </w:rPr>
+      </w:pPr>
+      <w:r>
+        <w:rPr>
+          <w:rFonts w:cs="Times New Roman"/>
+        </w:rPr>
+        <w:br w:type="page"/>
+      </w:r>
+    </w:p>
+    <w:p>
+      <w:pPr>
+        <w:pStyle w:val="Ttulo1"/>
+        <w:rPr>
+          <w:rFonts w:cs="Times New Roman"/>
+        </w:rPr>
+      </w:pPr>
+      <w:bookmarkStart w:id="28" w:name="_Toc241959189"/>
       <w:bookmarkEnd w:id="27"/>
-    </w:p>
-    <w:p>
-      <w:pPr>
-        <w:rPr>
-          <w:rFonts w:cs="Times New Roman"/>
-        </w:rPr>
-      </w:pPr>
-    </w:p>
-    <w:p>
-      <w:pPr>
-        <w:rPr>
-          <w:rFonts w:cs="Times New Roman"/>
-        </w:rPr>
-      </w:pPr>
-    </w:p>
-    <w:p>
-      <w:pPr>
-        <w:rPr>
-          <w:rFonts w:cs="Times New Roman"/>
-        </w:rPr>
-      </w:pPr>
-    </w:p>
-    <w:p>
-      <w:pPr>
-        <w:rPr>
-          <w:rFonts w:cs="Times New Roman"/>
-        </w:rPr>
-      </w:pPr>
-    </w:p>
-    <w:p>
-      <w:pPr>
-        <w:rPr>
-          <w:rFonts w:cs="Times New Roman"/>
-        </w:rPr>
-      </w:pPr>
-      <w:r>
-        <w:rPr>
-          <w:rFonts w:cs="Times New Roman"/>
-        </w:rPr>
-        <w:br w:type="page"/>
-      </w:r>
-    </w:p>
-    <w:p>
-      <w:pPr>
-        <w:pStyle w:val="Ttulo1"/>
-        <w:rPr>
-          <w:rFonts w:cs="Times New Roman"/>
-        </w:rPr>
-      </w:pPr>
-      <w:bookmarkStart w:id="28" w:name="_Toc241959189"/>
       <w:r>
         <w:rPr>
           <w:rFonts w:cs="Times New Roman"/>
@@ -6003,10 +6044,66 @@
         <w:pStyle w:val="Ttulo1"/>
         <w:rPr>
           <w:rFonts w:cs="Times New Roman"/>
+        </w:rPr>
+      </w:pPr>
+      <w:bookmarkStart w:id="29" w:name="_Toc241959190"/>
+      <w:r>
+        <w:rPr>
+          <w:rFonts w:cs="Times New Roman"/>
+        </w:rPr>
+        <w:lastRenderedPageBreak/>
+        <w:t>Glosario</w:t>
+      </w:r>
+    </w:p>
+    <w:p>
+      <w:pPr>
+        <w:rPr>
+          <w:rFonts w:cs="Times New Roman"/>
+        </w:rPr>
+      </w:pPr>
+    </w:p>
+    <w:p>
+      <w:pPr>
+        <w:rPr>
+          <w:rFonts w:cs="Times New Roman"/>
+        </w:rPr>
+      </w:pPr>
+    </w:p>
+    <w:p>
+      <w:pPr>
+        <w:rPr>
+          <w:rFonts w:cs="Times New Roman"/>
+        </w:rPr>
+      </w:pPr>
+    </w:p>
+    <w:p>
+      <w:pPr>
+        <w:rPr>
+          <w:rFonts w:cs="Times New Roman"/>
+        </w:rPr>
+      </w:pPr>
+    </w:p>
+    <w:p>
+      <w:pPr>
+        <w:rPr>
+          <w:rFonts w:cs="Times New Roman"/>
+        </w:rPr>
+      </w:pPr>
+      <w:r>
+        <w:rPr>
+          <w:rFonts w:cs="Times New Roman"/>
+        </w:rPr>
+        <w:br w:type="page"/>
+      </w:r>
+    </w:p>
+    <w:p>
+      <w:pPr>
+        <w:pStyle w:val="Ttulo1"/>
+        <w:rPr>
+          <w:rFonts w:cs="Times New Roman"/>
           <w:szCs w:val="24"/>
         </w:rPr>
       </w:pPr>
-      <w:bookmarkStart w:id="29" w:name="_Toc241959190"/>
       <w:r>
         <w:rPr>
           <w:rFonts w:cs="Times New Roman"/>

</xml_diff>